<commit_message>
ajuste parte de calculo
</commit_message>
<xml_diff>
--- a/TCC_HILTON_DOS_SANTOS_HOMEM 2026-2.revSimonedocx.docx
+++ b/TCC_HILTON_DOS_SANTOS_HOMEM 2026-2.revSimonedocx.docx
@@ -2504,6 +2504,2085 @@
         </w:docPartObj>
       </w:sdtPr>
       <w:sdtContent>
+        <w:p>
+          <w:pPr>
+            <w:pStyle w:val="Sumrio1"/>
+            <w:tabs>
+              <w:tab w:val="left" w:pos="440"/>
+              <w:tab w:val="right" w:leader="dot" w:pos="9062"/>
+            </w:tabs>
+            <w:rPr>
+              <w:rFonts w:asciiTheme="minorHAnsi" w:eastAsiaTheme="minorEastAsia" w:hAnsiTheme="minorHAnsi" w:cstheme="minorBidi"/>
+              <w:noProof/>
+              <w:sz w:val="22"/>
+              <w:szCs w:val="22"/>
+            </w:rPr>
+          </w:pPr>
+          <w:r>
+            <w:fldChar w:fldCharType="begin"/>
+          </w:r>
+          <w:r>
+            <w:instrText xml:space="preserve"> TOC \o "1-3" \h \z \u </w:instrText>
+          </w:r>
+          <w:r>
+            <w:fldChar w:fldCharType="separate"/>
+          </w:r>
+          <w:hyperlink w:anchor="_Toc_auto_1_1" w:history="1">
+            <w:r>
+              <w:rPr>
+                <w:rFonts w:ascii="Arial" w:hAnsi="Arial" w:cs="Arial"/>
+                <w:rStyle w:val="Hyperlink"/>
+                <w:noProof/>
+              </w:rPr>
+              <w:t>1</w:t>
+            </w:r>
+            <w:r>
+              <w:rPr>
+                <w:rFonts w:asciiTheme="minorHAnsi" w:eastAsiaTheme="minorEastAsia" w:hAnsiTheme="minorHAnsi" w:cstheme="minorBidi" w:ascii="Arial" w:hAnsi="Arial" w:cs="Arial"/>
+                <w:noProof/>
+                <w:sz w:val="22"/>
+                <w:szCs w:val="22"/>
+              </w:rPr>
+              <w:tab/>
+            </w:r>
+            <w:r>
+              <w:rPr>
+                <w:rFonts w:ascii="Arial" w:hAnsi="Arial" w:cs="Arial"/>
+                <w:rStyle w:val="Hyperlink"/>
+                <w:noProof/>
+              </w:rPr>
+              <w:t>INTRODUÇÃO</w:t>
+            </w:r>
+            <w:r>
+              <w:rPr>
+                <w:rFonts w:ascii="Arial" w:hAnsi="Arial" w:cs="Arial"/>
+                <w:noProof/>
+                <w:webHidden/>
+              </w:rPr>
+              <w:tab/>
+            </w:r>
+            <w:r>
+              <w:rPr>
+                <w:rFonts w:ascii="Arial" w:hAnsi="Arial" w:cs="Arial"/>
+                <w:noProof/>
+                <w:webHidden/>
+              </w:rPr>
+              <w:fldChar w:fldCharType="begin"/>
+            </w:r>
+            <w:r>
+              <w:rPr>
+                <w:rFonts w:ascii="Arial" w:hAnsi="Arial" w:cs="Arial"/>
+                <w:noProof/>
+                <w:webHidden/>
+              </w:rPr>
+              <w:instrText xml:space="preserve"> PAGEREF _Toc_auto_1_1 \h </w:instrText>
+            </w:r>
+            <w:r>
+              <w:rPr>
+                <w:rFonts w:ascii="Arial" w:hAnsi="Arial" w:cs="Arial"/>
+                <w:noProof/>
+                <w:webHidden/>
+              </w:rPr>
+              <w:fldChar w:fldCharType="separate"/>
+            </w:r>
+            <w:r>
+              <w:rPr>
+                <w:rFonts w:ascii="Arial" w:hAnsi="Arial" w:cs="Arial"/>
+                <w:noProof/>
+                <w:webHidden/>
+              </w:rPr>
+              <w:t>13</w:t>
+            </w:r>
+            <w:r>
+              <w:rPr>
+                <w:rFonts w:ascii="Arial" w:hAnsi="Arial" w:cs="Arial"/>
+                <w:noProof/>
+                <w:webHidden/>
+              </w:rPr>
+              <w:fldChar w:fldCharType="end"/>
+            </w:r>
+          </w:hyperlink>
+        </w:p>
+        <w:p>
+          <w:pPr>
+            <w:pStyle w:val="Sumrio1"/>
+            <w:tabs>
+              <w:tab w:val="left" w:pos="440"/>
+              <w:tab w:val="right" w:leader="dot" w:pos="9062"/>
+            </w:tabs>
+            <w:rPr>
+              <w:rFonts w:asciiTheme="minorHAnsi" w:eastAsiaTheme="minorEastAsia" w:hAnsiTheme="minorHAnsi" w:cstheme="minorBidi"/>
+              <w:noProof/>
+              <w:sz w:val="22"/>
+              <w:szCs w:val="22"/>
+            </w:rPr>
+          </w:pPr>
+          <w:hyperlink w:anchor="_Toc_auto_1_2" w:history="1">
+            <w:r>
+              <w:rPr>
+                <w:rFonts w:ascii="Arial" w:hAnsi="Arial" w:cs="Arial"/>
+                <w:rStyle w:val="Hyperlink"/>
+                <w:noProof/>
+              </w:rPr>
+              <w:t>2</w:t>
+            </w:r>
+            <w:r>
+              <w:rPr>
+                <w:rFonts w:asciiTheme="minorHAnsi" w:eastAsiaTheme="minorEastAsia" w:hAnsiTheme="minorHAnsi" w:cstheme="minorBidi" w:ascii="Arial" w:hAnsi="Arial" w:cs="Arial"/>
+                <w:noProof/>
+                <w:sz w:val="22"/>
+                <w:szCs w:val="22"/>
+              </w:rPr>
+              <w:tab/>
+            </w:r>
+            <w:r>
+              <w:rPr>
+                <w:rFonts w:ascii="Arial" w:hAnsi="Arial" w:cs="Arial"/>
+                <w:rStyle w:val="Hyperlink"/>
+                <w:noProof/>
+              </w:rPr>
+              <w:t>DEFINIÇÃO DO PROBLEMA</w:t>
+            </w:r>
+            <w:r>
+              <w:rPr>
+                <w:rFonts w:ascii="Arial" w:hAnsi="Arial" w:cs="Arial"/>
+                <w:noProof/>
+                <w:webHidden/>
+              </w:rPr>
+              <w:tab/>
+            </w:r>
+            <w:r>
+              <w:rPr>
+                <w:rFonts w:ascii="Arial" w:hAnsi="Arial" w:cs="Arial"/>
+                <w:noProof/>
+                <w:webHidden/>
+              </w:rPr>
+              <w:fldChar w:fldCharType="begin"/>
+            </w:r>
+            <w:r>
+              <w:rPr>
+                <w:rFonts w:ascii="Arial" w:hAnsi="Arial" w:cs="Arial"/>
+                <w:noProof/>
+                <w:webHidden/>
+              </w:rPr>
+              <w:instrText xml:space="preserve"> PAGEREF _Toc_auto_1_2 \h </w:instrText>
+            </w:r>
+            <w:r>
+              <w:rPr>
+                <w:rFonts w:ascii="Arial" w:hAnsi="Arial" w:cs="Arial"/>
+                <w:noProof/>
+                <w:webHidden/>
+              </w:rPr>
+              <w:fldChar w:fldCharType="separate"/>
+            </w:r>
+            <w:r>
+              <w:rPr>
+                <w:rFonts w:ascii="Arial" w:hAnsi="Arial" w:cs="Arial"/>
+                <w:noProof/>
+                <w:webHidden/>
+              </w:rPr>
+              <w:t>14</w:t>
+            </w:r>
+            <w:r>
+              <w:rPr>
+                <w:rFonts w:ascii="Arial" w:hAnsi="Arial" w:cs="Arial"/>
+                <w:noProof/>
+                <w:webHidden/>
+              </w:rPr>
+              <w:fldChar w:fldCharType="end"/>
+            </w:r>
+          </w:hyperlink>
+        </w:p>
+        <w:p>
+          <w:pPr>
+            <w:pStyle w:val="Sumrio2"/>
+            <w:tabs>
+              <w:tab w:val="left" w:pos="880"/>
+              <w:tab w:val="right" w:leader="dot" w:pos="9062"/>
+            </w:tabs>
+            <w:rPr>
+              <w:rFonts w:asciiTheme="minorHAnsi" w:eastAsiaTheme="minorEastAsia" w:hAnsiTheme="minorHAnsi" w:cstheme="minorBidi"/>
+              <w:noProof/>
+              <w:sz w:val="22"/>
+              <w:szCs w:val="22"/>
+            </w:rPr>
+          </w:pPr>
+          <w:hyperlink w:anchor="_Toc_auto_2_3" w:history="1">
+            <w:r>
+              <w:rPr>
+                <w:rFonts w:ascii="Arial" w:hAnsi="Arial" w:cs="Arial"/>
+                <w:rStyle w:val="Hyperlink"/>
+                <w:noProof/>
+              </w:rPr>
+              <w:t>3</w:t>
+            </w:r>
+            <w:r>
+              <w:rPr>
+                <w:rFonts w:asciiTheme="minorHAnsi" w:eastAsiaTheme="minorEastAsia" w:hAnsiTheme="minorHAnsi" w:cstheme="minorBidi" w:ascii="Arial" w:hAnsi="Arial" w:cs="Arial"/>
+                <w:noProof/>
+                <w:sz w:val="22"/>
+                <w:szCs w:val="22"/>
+              </w:rPr>
+              <w:tab/>
+            </w:r>
+            <w:r>
+              <w:rPr>
+                <w:rFonts w:ascii="Arial" w:hAnsi="Arial" w:cs="Arial"/>
+                <w:rStyle w:val="Hyperlink"/>
+                <w:noProof/>
+              </w:rPr>
+              <w:t>OBJETIVOS</w:t>
+            </w:r>
+            <w:r>
+              <w:rPr>
+                <w:rFonts w:ascii="Arial" w:hAnsi="Arial" w:cs="Arial"/>
+                <w:noProof/>
+                <w:webHidden/>
+              </w:rPr>
+              <w:tab/>
+            </w:r>
+            <w:r>
+              <w:rPr>
+                <w:rFonts w:ascii="Arial" w:hAnsi="Arial" w:cs="Arial"/>
+                <w:noProof/>
+                <w:webHidden/>
+              </w:rPr>
+              <w:fldChar w:fldCharType="begin"/>
+            </w:r>
+            <w:r>
+              <w:rPr>
+                <w:rFonts w:ascii="Arial" w:hAnsi="Arial" w:cs="Arial"/>
+                <w:noProof/>
+                <w:webHidden/>
+              </w:rPr>
+              <w:instrText xml:space="preserve"> PAGEREF _Toc_auto_2_3 \h </w:instrText>
+            </w:r>
+            <w:r>
+              <w:rPr>
+                <w:rFonts w:ascii="Arial" w:hAnsi="Arial" w:cs="Arial"/>
+                <w:noProof/>
+                <w:webHidden/>
+              </w:rPr>
+              <w:fldChar w:fldCharType="separate"/>
+            </w:r>
+            <w:r>
+              <w:rPr>
+                <w:rFonts w:ascii="Arial" w:hAnsi="Arial" w:cs="Arial"/>
+                <w:noProof/>
+                <w:webHidden/>
+              </w:rPr>
+              <w:t>15</w:t>
+            </w:r>
+            <w:r>
+              <w:rPr>
+                <w:rFonts w:ascii="Arial" w:hAnsi="Arial" w:cs="Arial"/>
+                <w:noProof/>
+                <w:webHidden/>
+              </w:rPr>
+              <w:fldChar w:fldCharType="end"/>
+            </w:r>
+          </w:hyperlink>
+        </w:p>
+        <w:p>
+          <w:pPr>
+            <w:pStyle w:val="Sumrio2"/>
+            <w:tabs>
+              <w:tab w:val="left" w:pos="880"/>
+              <w:tab w:val="right" w:leader="dot" w:pos="9062"/>
+            </w:tabs>
+            <w:rPr>
+              <w:rFonts w:asciiTheme="minorHAnsi" w:eastAsiaTheme="minorEastAsia" w:hAnsiTheme="minorHAnsi" w:cstheme="minorBidi"/>
+              <w:noProof/>
+              <w:sz w:val="22"/>
+              <w:szCs w:val="22"/>
+            </w:rPr>
+          </w:pPr>
+          <w:hyperlink w:anchor="_Toc_auto_3_3_1" w:history="1">
+            <w:r>
+              <w:rPr>
+                <w:rFonts w:ascii="Arial" w:hAnsi="Arial" w:cs="Arial"/>
+                <w:rStyle w:val="Hyperlink"/>
+                <w:noProof/>
+              </w:rPr>
+              <w:t>3.1</w:t>
+            </w:r>
+            <w:r>
+              <w:rPr>
+                <w:rFonts w:asciiTheme="minorHAnsi" w:eastAsiaTheme="minorEastAsia" w:hAnsiTheme="minorHAnsi" w:cstheme="minorBidi" w:ascii="Arial" w:hAnsi="Arial" w:cs="Arial"/>
+                <w:noProof/>
+                <w:sz w:val="22"/>
+                <w:szCs w:val="22"/>
+              </w:rPr>
+              <w:tab/>
+            </w:r>
+            <w:r>
+              <w:rPr>
+                <w:rFonts w:ascii="Arial" w:hAnsi="Arial" w:cs="Arial"/>
+                <w:rStyle w:val="Hyperlink"/>
+                <w:noProof/>
+              </w:rPr>
+              <w:t>OBJETIVO GERAL</w:t>
+            </w:r>
+            <w:r>
+              <w:rPr>
+                <w:rFonts w:ascii="Arial" w:hAnsi="Arial" w:cs="Arial"/>
+                <w:noProof/>
+                <w:webHidden/>
+              </w:rPr>
+              <w:tab/>
+            </w:r>
+            <w:r>
+              <w:rPr>
+                <w:rFonts w:ascii="Arial" w:hAnsi="Arial" w:cs="Arial"/>
+                <w:noProof/>
+                <w:webHidden/>
+              </w:rPr>
+              <w:fldChar w:fldCharType="begin"/>
+            </w:r>
+            <w:r>
+              <w:rPr>
+                <w:rFonts w:ascii="Arial" w:hAnsi="Arial" w:cs="Arial"/>
+                <w:noProof/>
+                <w:webHidden/>
+              </w:rPr>
+              <w:instrText xml:space="preserve"> PAGEREF _Toc_auto_3_3_1 \h </w:instrText>
+            </w:r>
+            <w:r>
+              <w:rPr>
+                <w:rFonts w:ascii="Arial" w:hAnsi="Arial" w:cs="Arial"/>
+                <w:noProof/>
+                <w:webHidden/>
+              </w:rPr>
+              <w:fldChar w:fldCharType="separate"/>
+            </w:r>
+            <w:r>
+              <w:rPr>
+                <w:rFonts w:ascii="Arial" w:hAnsi="Arial" w:cs="Arial"/>
+                <w:noProof/>
+                <w:webHidden/>
+              </w:rPr>
+              <w:t>15</w:t>
+            </w:r>
+            <w:r>
+              <w:rPr>
+                <w:rFonts w:ascii="Arial" w:hAnsi="Arial" w:cs="Arial"/>
+                <w:noProof/>
+                <w:webHidden/>
+              </w:rPr>
+              <w:fldChar w:fldCharType="end"/>
+            </w:r>
+          </w:hyperlink>
+        </w:p>
+        <w:p>
+          <w:pPr>
+            <w:pStyle w:val="Sumrio2"/>
+            <w:tabs>
+              <w:tab w:val="left" w:pos="880"/>
+              <w:tab w:val="right" w:leader="dot" w:pos="9062"/>
+            </w:tabs>
+            <w:rPr>
+              <w:rFonts w:asciiTheme="minorHAnsi" w:eastAsiaTheme="minorEastAsia" w:hAnsiTheme="minorHAnsi" w:cstheme="minorBidi"/>
+              <w:noProof/>
+              <w:sz w:val="22"/>
+              <w:szCs w:val="22"/>
+            </w:rPr>
+          </w:pPr>
+          <w:hyperlink w:anchor="_Toc_auto_3_3_2" w:history="1">
+            <w:r>
+              <w:rPr>
+                <w:rFonts w:ascii="Arial" w:hAnsi="Arial" w:cs="Arial"/>
+                <w:rStyle w:val="Hyperlink"/>
+                <w:noProof/>
+              </w:rPr>
+              <w:t>3.2</w:t>
+            </w:r>
+            <w:r>
+              <w:rPr>
+                <w:rFonts w:asciiTheme="minorHAnsi" w:eastAsiaTheme="minorEastAsia" w:hAnsiTheme="minorHAnsi" w:cstheme="minorBidi" w:ascii="Arial" w:hAnsi="Arial" w:cs="Arial"/>
+                <w:noProof/>
+                <w:sz w:val="22"/>
+                <w:szCs w:val="22"/>
+              </w:rPr>
+              <w:tab/>
+            </w:r>
+            <w:r>
+              <w:rPr>
+                <w:rFonts w:ascii="Arial" w:hAnsi="Arial" w:cs="Arial"/>
+                <w:rStyle w:val="Hyperlink"/>
+                <w:noProof/>
+              </w:rPr>
+              <w:t>OBJETIVOS ESPECÍFICOS</w:t>
+            </w:r>
+            <w:r>
+              <w:rPr>
+                <w:rFonts w:ascii="Arial" w:hAnsi="Arial" w:cs="Arial"/>
+                <w:noProof/>
+                <w:webHidden/>
+              </w:rPr>
+              <w:tab/>
+            </w:r>
+            <w:r>
+              <w:rPr>
+                <w:rFonts w:ascii="Arial" w:hAnsi="Arial" w:cs="Arial"/>
+                <w:noProof/>
+                <w:webHidden/>
+              </w:rPr>
+              <w:fldChar w:fldCharType="begin"/>
+            </w:r>
+            <w:r>
+              <w:rPr>
+                <w:rFonts w:ascii="Arial" w:hAnsi="Arial" w:cs="Arial"/>
+                <w:noProof/>
+                <w:webHidden/>
+              </w:rPr>
+              <w:instrText xml:space="preserve"> PAGEREF _Toc_auto_3_3_2 \h </w:instrText>
+            </w:r>
+            <w:r>
+              <w:rPr>
+                <w:rFonts w:ascii="Arial" w:hAnsi="Arial" w:cs="Arial"/>
+                <w:noProof/>
+                <w:webHidden/>
+              </w:rPr>
+              <w:fldChar w:fldCharType="separate"/>
+            </w:r>
+            <w:r>
+              <w:rPr>
+                <w:rFonts w:ascii="Arial" w:hAnsi="Arial" w:cs="Arial"/>
+                <w:noProof/>
+                <w:webHidden/>
+              </w:rPr>
+              <w:t>15</w:t>
+            </w:r>
+            <w:r>
+              <w:rPr>
+                <w:rFonts w:ascii="Arial" w:hAnsi="Arial" w:cs="Arial"/>
+                <w:noProof/>
+                <w:webHidden/>
+              </w:rPr>
+              <w:fldChar w:fldCharType="end"/>
+            </w:r>
+          </w:hyperlink>
+        </w:p>
+        <w:p>
+          <w:pPr>
+            <w:pStyle w:val="Sumrio1"/>
+            <w:tabs>
+              <w:tab w:val="left" w:pos="440"/>
+              <w:tab w:val="right" w:leader="dot" w:pos="9062"/>
+            </w:tabs>
+            <w:rPr>
+              <w:rFonts w:asciiTheme="minorHAnsi" w:eastAsiaTheme="minorEastAsia" w:hAnsiTheme="minorHAnsi" w:cstheme="minorBidi"/>
+              <w:noProof/>
+              <w:sz w:val="22"/>
+              <w:szCs w:val="22"/>
+            </w:rPr>
+          </w:pPr>
+          <w:hyperlink w:anchor="_Toc_auto_1_3" w:history="1">
+            <w:r>
+              <w:rPr>
+                <w:rFonts w:ascii="Arial" w:hAnsi="Arial" w:cs="Arial"/>
+                <w:rStyle w:val="Hyperlink"/>
+                <w:noProof/>
+              </w:rPr>
+              <w:t>3</w:t>
+            </w:r>
+            <w:r>
+              <w:rPr>
+                <w:rFonts w:asciiTheme="minorHAnsi" w:eastAsiaTheme="minorEastAsia" w:hAnsiTheme="minorHAnsi" w:cstheme="minorBidi" w:ascii="Arial" w:hAnsi="Arial" w:cs="Arial"/>
+                <w:noProof/>
+                <w:sz w:val="22"/>
+                <w:szCs w:val="22"/>
+              </w:rPr>
+              <w:tab/>
+            </w:r>
+            <w:r>
+              <w:rPr>
+                <w:rFonts w:ascii="Arial" w:hAnsi="Arial" w:cs="Arial"/>
+                <w:rStyle w:val="Hyperlink"/>
+                <w:noProof/>
+              </w:rPr>
+              <w:t>JUSTIFICATIVA</w:t>
+            </w:r>
+            <w:r>
+              <w:rPr>
+                <w:rFonts w:ascii="Arial" w:hAnsi="Arial" w:cs="Arial"/>
+                <w:noProof/>
+                <w:webHidden/>
+              </w:rPr>
+              <w:tab/>
+            </w:r>
+            <w:r>
+              <w:rPr>
+                <w:rFonts w:ascii="Arial" w:hAnsi="Arial" w:cs="Arial"/>
+                <w:noProof/>
+                <w:webHidden/>
+              </w:rPr>
+              <w:fldChar w:fldCharType="begin"/>
+            </w:r>
+            <w:r>
+              <w:rPr>
+                <w:rFonts w:ascii="Arial" w:hAnsi="Arial" w:cs="Arial"/>
+                <w:noProof/>
+                <w:webHidden/>
+              </w:rPr>
+              <w:instrText xml:space="preserve"> PAGEREF _Toc_auto_1_3 \h </w:instrText>
+            </w:r>
+            <w:r>
+              <w:rPr>
+                <w:rFonts w:ascii="Arial" w:hAnsi="Arial" w:cs="Arial"/>
+                <w:noProof/>
+                <w:webHidden/>
+              </w:rPr>
+              <w:fldChar w:fldCharType="separate"/>
+            </w:r>
+            <w:r>
+              <w:rPr>
+                <w:rFonts w:ascii="Arial" w:hAnsi="Arial" w:cs="Arial"/>
+                <w:noProof/>
+                <w:webHidden/>
+              </w:rPr>
+              <w:t>17</w:t>
+            </w:r>
+            <w:r>
+              <w:rPr>
+                <w:rFonts w:ascii="Arial" w:hAnsi="Arial" w:cs="Arial"/>
+                <w:noProof/>
+                <w:webHidden/>
+              </w:rPr>
+              <w:fldChar w:fldCharType="end"/>
+            </w:r>
+          </w:hyperlink>
+        </w:p>
+        <w:p>
+          <w:pPr>
+            <w:pStyle w:val="Sumrio1"/>
+            <w:tabs>
+              <w:tab w:val="left" w:pos="440"/>
+              <w:tab w:val="right" w:leader="dot" w:pos="9062"/>
+            </w:tabs>
+            <w:rPr>
+              <w:rFonts w:asciiTheme="minorHAnsi" w:eastAsiaTheme="minorEastAsia" w:hAnsiTheme="minorHAnsi" w:cstheme="minorBidi"/>
+              <w:noProof/>
+              <w:sz w:val="22"/>
+              <w:szCs w:val="22"/>
+            </w:rPr>
+          </w:pPr>
+          <w:hyperlink w:anchor="_Toc_auto_1_4" w:history="1">
+            <w:r>
+              <w:rPr>
+                <w:rFonts w:ascii="Arial" w:hAnsi="Arial" w:cs="Arial"/>
+                <w:rStyle w:val="Hyperlink"/>
+                <w:noProof/>
+              </w:rPr>
+              <w:t>4</w:t>
+            </w:r>
+            <w:r>
+              <w:rPr>
+                <w:rFonts w:asciiTheme="minorHAnsi" w:eastAsiaTheme="minorEastAsia" w:hAnsiTheme="minorHAnsi" w:cstheme="minorBidi" w:ascii="Arial" w:hAnsi="Arial" w:cs="Arial"/>
+                <w:noProof/>
+                <w:sz w:val="22"/>
+                <w:szCs w:val="22"/>
+              </w:rPr>
+              <w:tab/>
+            </w:r>
+            <w:r>
+              <w:rPr>
+                <w:rFonts w:ascii="Arial" w:hAnsi="Arial" w:cs="Arial"/>
+                <w:rStyle w:val="Hyperlink"/>
+                <w:noProof/>
+              </w:rPr>
+              <w:t>METODOLOGIA E ARQUITETURA DA SOLUÇÃO</w:t>
+            </w:r>
+            <w:r>
+              <w:rPr>
+                <w:rFonts w:ascii="Arial" w:hAnsi="Arial" w:cs="Arial"/>
+                <w:noProof/>
+                <w:webHidden/>
+              </w:rPr>
+              <w:tab/>
+            </w:r>
+            <w:r>
+              <w:rPr>
+                <w:rFonts w:ascii="Arial" w:hAnsi="Arial" w:cs="Arial"/>
+                <w:noProof/>
+                <w:webHidden/>
+              </w:rPr>
+              <w:fldChar w:fldCharType="begin"/>
+            </w:r>
+            <w:r>
+              <w:rPr>
+                <w:rFonts w:ascii="Arial" w:hAnsi="Arial" w:cs="Arial"/>
+                <w:noProof/>
+                <w:webHidden/>
+              </w:rPr>
+              <w:instrText xml:space="preserve"> PAGEREF _Toc_auto_1_4 \h </w:instrText>
+            </w:r>
+            <w:r>
+              <w:rPr>
+                <w:rFonts w:ascii="Arial" w:hAnsi="Arial" w:cs="Arial"/>
+                <w:noProof/>
+                <w:webHidden/>
+              </w:rPr>
+              <w:fldChar w:fldCharType="separate"/>
+            </w:r>
+            <w:r>
+              <w:rPr>
+                <w:rFonts w:ascii="Arial" w:hAnsi="Arial" w:cs="Arial"/>
+                <w:noProof/>
+                <w:webHidden/>
+              </w:rPr>
+              <w:t>18</w:t>
+            </w:r>
+            <w:r>
+              <w:rPr>
+                <w:rFonts w:ascii="Arial" w:hAnsi="Arial" w:cs="Arial"/>
+                <w:noProof/>
+                <w:webHidden/>
+              </w:rPr>
+              <w:fldChar w:fldCharType="end"/>
+            </w:r>
+          </w:hyperlink>
+        </w:p>
+        <w:p>
+          <w:pPr>
+            <w:pStyle w:val="Sumrio2"/>
+            <w:tabs>
+              <w:tab w:val="left" w:pos="880"/>
+              <w:tab w:val="right" w:leader="dot" w:pos="9062"/>
+            </w:tabs>
+            <w:rPr>
+              <w:rFonts w:asciiTheme="minorHAnsi" w:eastAsiaTheme="minorEastAsia" w:hAnsiTheme="minorHAnsi" w:cstheme="minorBidi"/>
+              <w:noProof/>
+              <w:sz w:val="22"/>
+              <w:szCs w:val="22"/>
+            </w:rPr>
+          </w:pPr>
+          <w:hyperlink w:anchor="_Toc_auto_2_4_1" w:history="1">
+            <w:r>
+              <w:rPr>
+                <w:rFonts w:ascii="Arial" w:hAnsi="Arial" w:cs="Arial"/>
+                <w:rStyle w:val="Hyperlink"/>
+                <w:noProof/>
+              </w:rPr>
+              <w:t>4.1</w:t>
+            </w:r>
+            <w:r>
+              <w:rPr>
+                <w:rFonts w:asciiTheme="minorHAnsi" w:eastAsiaTheme="minorEastAsia" w:hAnsiTheme="minorHAnsi" w:cstheme="minorBidi" w:ascii="Arial" w:hAnsi="Arial" w:cs="Arial"/>
+                <w:noProof/>
+                <w:sz w:val="22"/>
+                <w:szCs w:val="22"/>
+              </w:rPr>
+              <w:tab/>
+            </w:r>
+            <w:r>
+              <w:rPr>
+                <w:rFonts w:ascii="Arial" w:hAnsi="Arial" w:cs="Arial"/>
+                <w:rStyle w:val="Hyperlink"/>
+                <w:noProof/>
+              </w:rPr>
+              <w:t>Desacoplamento Arquitetural e Transição para o Modelo Cliente-Servidor</w:t>
+            </w:r>
+            <w:r>
+              <w:rPr>
+                <w:rFonts w:ascii="Arial" w:hAnsi="Arial" w:cs="Arial"/>
+                <w:noProof/>
+                <w:webHidden/>
+              </w:rPr>
+              <w:tab/>
+            </w:r>
+            <w:r>
+              <w:rPr>
+                <w:rFonts w:ascii="Arial" w:hAnsi="Arial" w:cs="Arial"/>
+                <w:noProof/>
+                <w:webHidden/>
+              </w:rPr>
+              <w:fldChar w:fldCharType="begin"/>
+            </w:r>
+            <w:r>
+              <w:rPr>
+                <w:rFonts w:ascii="Arial" w:hAnsi="Arial" w:cs="Arial"/>
+                <w:noProof/>
+                <w:webHidden/>
+              </w:rPr>
+              <w:instrText xml:space="preserve"> PAGEREF _Toc_auto_2_4_1 \h </w:instrText>
+            </w:r>
+            <w:r>
+              <w:rPr>
+                <w:rFonts w:ascii="Arial" w:hAnsi="Arial" w:cs="Arial"/>
+                <w:noProof/>
+                <w:webHidden/>
+              </w:rPr>
+              <w:fldChar w:fldCharType="separate"/>
+            </w:r>
+            <w:r>
+              <w:rPr>
+                <w:rFonts w:ascii="Arial" w:hAnsi="Arial" w:cs="Arial"/>
+                <w:noProof/>
+                <w:webHidden/>
+              </w:rPr>
+              <w:t>18</w:t>
+            </w:r>
+            <w:r>
+              <w:rPr>
+                <w:rFonts w:ascii="Arial" w:hAnsi="Arial" w:cs="Arial"/>
+                <w:noProof/>
+                <w:webHidden/>
+              </w:rPr>
+              <w:fldChar w:fldCharType="end"/>
+            </w:r>
+          </w:hyperlink>
+        </w:p>
+        <w:p>
+          <w:pPr>
+            <w:pStyle w:val="Sumrio2"/>
+            <w:tabs>
+              <w:tab w:val="left" w:pos="880"/>
+              <w:tab w:val="right" w:leader="dot" w:pos="9062"/>
+            </w:tabs>
+            <w:rPr>
+              <w:rFonts w:asciiTheme="minorHAnsi" w:eastAsiaTheme="minorEastAsia" w:hAnsiTheme="minorHAnsi" w:cstheme="minorBidi"/>
+              <w:noProof/>
+              <w:sz w:val="22"/>
+              <w:szCs w:val="22"/>
+            </w:rPr>
+          </w:pPr>
+          <w:hyperlink w:anchor="_Toc_auto_2_4_2" w:history="1">
+            <w:r>
+              <w:rPr>
+                <w:rFonts w:ascii="Arial" w:hAnsi="Arial" w:cs="Arial"/>
+                <w:rStyle w:val="Hyperlink"/>
+                <w:noProof/>
+              </w:rPr>
+              <w:t>4.2</w:t>
+            </w:r>
+            <w:r>
+              <w:rPr>
+                <w:rFonts w:asciiTheme="minorHAnsi" w:eastAsiaTheme="minorEastAsia" w:hAnsiTheme="minorHAnsi" w:cstheme="minorBidi" w:ascii="Arial" w:hAnsi="Arial" w:cs="Arial"/>
+                <w:noProof/>
+                <w:sz w:val="22"/>
+                <w:szCs w:val="22"/>
+              </w:rPr>
+              <w:tab/>
+            </w:r>
+            <w:r>
+              <w:rPr>
+                <w:rFonts w:ascii="Arial" w:hAnsi="Arial" w:cs="Arial"/>
+                <w:rStyle w:val="Hyperlink"/>
+                <w:noProof/>
+              </w:rPr>
+              <w:t>Tecnologias Empregadas no Front-end</w:t>
+            </w:r>
+            <w:r>
+              <w:rPr>
+                <w:rFonts w:ascii="Arial" w:hAnsi="Arial" w:cs="Arial"/>
+                <w:noProof/>
+                <w:webHidden/>
+              </w:rPr>
+              <w:tab/>
+            </w:r>
+            <w:r>
+              <w:rPr>
+                <w:rFonts w:ascii="Arial" w:hAnsi="Arial" w:cs="Arial"/>
+                <w:noProof/>
+                <w:webHidden/>
+              </w:rPr>
+              <w:fldChar w:fldCharType="begin"/>
+            </w:r>
+            <w:r>
+              <w:rPr>
+                <w:rFonts w:ascii="Arial" w:hAnsi="Arial" w:cs="Arial"/>
+                <w:noProof/>
+                <w:webHidden/>
+              </w:rPr>
+              <w:instrText xml:space="preserve"> PAGEREF _Toc_auto_2_4_2 \h </w:instrText>
+            </w:r>
+            <w:r>
+              <w:rPr>
+                <w:rFonts w:ascii="Arial" w:hAnsi="Arial" w:cs="Arial"/>
+                <w:noProof/>
+                <w:webHidden/>
+              </w:rPr>
+              <w:fldChar w:fldCharType="separate"/>
+            </w:r>
+            <w:r>
+              <w:rPr>
+                <w:rFonts w:ascii="Arial" w:hAnsi="Arial" w:cs="Arial"/>
+                <w:noProof/>
+                <w:webHidden/>
+              </w:rPr>
+              <w:t>19</w:t>
+            </w:r>
+            <w:r>
+              <w:rPr>
+                <w:rFonts w:ascii="Arial" w:hAnsi="Arial" w:cs="Arial"/>
+                <w:noProof/>
+                <w:webHidden/>
+              </w:rPr>
+              <w:fldChar w:fldCharType="end"/>
+            </w:r>
+          </w:hyperlink>
+        </w:p>
+        <w:p>
+          <w:pPr>
+            <w:pStyle w:val="Sumrio2"/>
+            <w:tabs>
+              <w:tab w:val="left" w:pos="880"/>
+              <w:tab w:val="right" w:leader="dot" w:pos="9062"/>
+            </w:tabs>
+            <w:rPr>
+              <w:rFonts w:asciiTheme="minorHAnsi" w:eastAsiaTheme="minorEastAsia" w:hAnsiTheme="minorHAnsi" w:cstheme="minorBidi"/>
+              <w:noProof/>
+              <w:sz w:val="22"/>
+              <w:szCs w:val="22"/>
+            </w:rPr>
+          </w:pPr>
+          <w:hyperlink w:anchor="_Toc_auto_2_4_3" w:history="1">
+            <w:r>
+              <w:rPr>
+                <w:rFonts w:ascii="Arial" w:hAnsi="Arial" w:cs="Arial"/>
+                <w:rStyle w:val="Hyperlink"/>
+                <w:noProof/>
+              </w:rPr>
+              <w:t>4.3</w:t>
+            </w:r>
+            <w:r>
+              <w:rPr>
+                <w:rFonts w:asciiTheme="minorHAnsi" w:eastAsiaTheme="minorEastAsia" w:hAnsiTheme="minorHAnsi" w:cstheme="minorBidi" w:ascii="Arial" w:hAnsi="Arial" w:cs="Arial"/>
+                <w:noProof/>
+                <w:sz w:val="22"/>
+                <w:szCs w:val="22"/>
+              </w:rPr>
+              <w:tab/>
+            </w:r>
+            <w:r>
+              <w:rPr>
+                <w:rFonts w:ascii="Arial" w:hAnsi="Arial" w:cs="Arial"/>
+                <w:rStyle w:val="Hyperlink"/>
+                <w:noProof/>
+              </w:rPr>
+              <w:t>Aplicação das Heurísticas de Usabilidade de Nielsen</w:t>
+            </w:r>
+            <w:r>
+              <w:rPr>
+                <w:rFonts w:ascii="Arial" w:hAnsi="Arial" w:cs="Arial"/>
+                <w:noProof/>
+                <w:webHidden/>
+              </w:rPr>
+              <w:tab/>
+            </w:r>
+            <w:r>
+              <w:rPr>
+                <w:rFonts w:ascii="Arial" w:hAnsi="Arial" w:cs="Arial"/>
+                <w:noProof/>
+                <w:webHidden/>
+              </w:rPr>
+              <w:fldChar w:fldCharType="begin"/>
+            </w:r>
+            <w:r>
+              <w:rPr>
+                <w:rFonts w:ascii="Arial" w:hAnsi="Arial" w:cs="Arial"/>
+                <w:noProof/>
+                <w:webHidden/>
+              </w:rPr>
+              <w:instrText xml:space="preserve"> PAGEREF _Toc_auto_2_4_3 \h </w:instrText>
+            </w:r>
+            <w:r>
+              <w:rPr>
+                <w:rFonts w:ascii="Arial" w:hAnsi="Arial" w:cs="Arial"/>
+                <w:noProof/>
+                <w:webHidden/>
+              </w:rPr>
+              <w:fldChar w:fldCharType="separate"/>
+            </w:r>
+            <w:r>
+              <w:rPr>
+                <w:rFonts w:ascii="Arial" w:hAnsi="Arial" w:cs="Arial"/>
+                <w:noProof/>
+                <w:webHidden/>
+              </w:rPr>
+              <w:t>20</w:t>
+            </w:r>
+            <w:r>
+              <w:rPr>
+                <w:rFonts w:ascii="Arial" w:hAnsi="Arial" w:cs="Arial"/>
+                <w:noProof/>
+                <w:webHidden/>
+              </w:rPr>
+              <w:fldChar w:fldCharType="end"/>
+            </w:r>
+          </w:hyperlink>
+        </w:p>
+        <w:p>
+          <w:pPr>
+            <w:pStyle w:val="Sumrio1"/>
+            <w:tabs>
+              <w:tab w:val="left" w:pos="440"/>
+              <w:tab w:val="right" w:leader="dot" w:pos="9062"/>
+            </w:tabs>
+            <w:rPr>
+              <w:rFonts w:asciiTheme="minorHAnsi" w:eastAsiaTheme="minorEastAsia" w:hAnsiTheme="minorHAnsi" w:cstheme="minorBidi"/>
+              <w:noProof/>
+              <w:sz w:val="22"/>
+              <w:szCs w:val="22"/>
+            </w:rPr>
+          </w:pPr>
+          <w:hyperlink w:anchor="_Toc_auto_1_5" w:history="1">
+            <w:r>
+              <w:rPr>
+                <w:rFonts w:ascii="Arial" w:hAnsi="Arial" w:cs="Arial"/>
+                <w:rStyle w:val="Hyperlink"/>
+                <w:noProof/>
+              </w:rPr>
+              <w:t>5</w:t>
+            </w:r>
+            <w:r>
+              <w:rPr>
+                <w:rFonts w:asciiTheme="minorHAnsi" w:eastAsiaTheme="minorEastAsia" w:hAnsiTheme="minorHAnsi" w:cstheme="minorBidi" w:ascii="Arial" w:hAnsi="Arial" w:cs="Arial"/>
+                <w:noProof/>
+                <w:sz w:val="22"/>
+                <w:szCs w:val="22"/>
+              </w:rPr>
+              <w:tab/>
+            </w:r>
+            <w:r>
+              <w:rPr>
+                <w:rFonts w:ascii="Arial" w:hAnsi="Arial" w:cs="Arial"/>
+                <w:rStyle w:val="Hyperlink"/>
+                <w:noProof/>
+              </w:rPr>
+              <w:t>IMPLEMENTAÇÃO DA INTERFACE E DETALHAMENTO DO CÓDIGO</w:t>
+            </w:r>
+            <w:r>
+              <w:rPr>
+                <w:rFonts w:ascii="Arial" w:hAnsi="Arial" w:cs="Arial"/>
+                <w:noProof/>
+                <w:webHidden/>
+              </w:rPr>
+              <w:tab/>
+            </w:r>
+            <w:r>
+              <w:rPr>
+                <w:rFonts w:ascii="Arial" w:hAnsi="Arial" w:cs="Arial"/>
+                <w:noProof/>
+                <w:webHidden/>
+              </w:rPr>
+              <w:fldChar w:fldCharType="begin"/>
+            </w:r>
+            <w:r>
+              <w:rPr>
+                <w:rFonts w:ascii="Arial" w:hAnsi="Arial" w:cs="Arial"/>
+                <w:noProof/>
+                <w:webHidden/>
+              </w:rPr>
+              <w:instrText xml:space="preserve"> PAGEREF _Toc_auto_1_5 \h </w:instrText>
+            </w:r>
+            <w:r>
+              <w:rPr>
+                <w:rFonts w:ascii="Arial" w:hAnsi="Arial" w:cs="Arial"/>
+                <w:noProof/>
+                <w:webHidden/>
+              </w:rPr>
+              <w:fldChar w:fldCharType="separate"/>
+            </w:r>
+            <w:r>
+              <w:rPr>
+                <w:rFonts w:ascii="Arial" w:hAnsi="Arial" w:cs="Arial"/>
+                <w:noProof/>
+                <w:webHidden/>
+              </w:rPr>
+              <w:t>21</w:t>
+            </w:r>
+            <w:r>
+              <w:rPr>
+                <w:rFonts w:ascii="Arial" w:hAnsi="Arial" w:cs="Arial"/>
+                <w:noProof/>
+                <w:webHidden/>
+              </w:rPr>
+              <w:fldChar w:fldCharType="end"/>
+            </w:r>
+          </w:hyperlink>
+        </w:p>
+        <w:p>
+          <w:pPr>
+            <w:pStyle w:val="Sumrio2"/>
+            <w:tabs>
+              <w:tab w:val="left" w:pos="880"/>
+              <w:tab w:val="right" w:leader="dot" w:pos="9062"/>
+            </w:tabs>
+            <w:rPr>
+              <w:rFonts w:asciiTheme="minorHAnsi" w:eastAsiaTheme="minorEastAsia" w:hAnsiTheme="minorHAnsi" w:cstheme="minorBidi"/>
+              <w:noProof/>
+              <w:sz w:val="22"/>
+              <w:szCs w:val="22"/>
+            </w:rPr>
+          </w:pPr>
+          <w:hyperlink w:anchor="_Toc_auto_2_5_1" w:history="1">
+            <w:r>
+              <w:rPr>
+                <w:rFonts w:ascii="Arial" w:hAnsi="Arial" w:cs="Arial"/>
+                <w:rStyle w:val="Hyperlink"/>
+                <w:noProof/>
+              </w:rPr>
+              <w:t>5.1</w:t>
+            </w:r>
+            <w:r>
+              <w:rPr>
+                <w:rFonts w:asciiTheme="minorHAnsi" w:eastAsiaTheme="minorEastAsia" w:hAnsiTheme="minorHAnsi" w:cstheme="minorBidi" w:ascii="Arial" w:hAnsi="Arial" w:cs="Arial"/>
+                <w:noProof/>
+                <w:sz w:val="22"/>
+                <w:szCs w:val="22"/>
+              </w:rPr>
+              <w:tab/>
+            </w:r>
+            <w:r>
+              <w:rPr>
+                <w:rFonts w:ascii="Arial" w:hAnsi="Arial" w:cs="Arial"/>
+                <w:rStyle w:val="Hyperlink"/>
+                <w:noProof/>
+              </w:rPr>
+              <w:t>Módulo de Parâmetros Globais e Dashboard (RF01 e RF02)</w:t>
+            </w:r>
+            <w:r>
+              <w:rPr>
+                <w:rFonts w:ascii="Arial" w:hAnsi="Arial" w:cs="Arial"/>
+                <w:noProof/>
+                <w:webHidden/>
+              </w:rPr>
+              <w:tab/>
+            </w:r>
+            <w:r>
+              <w:rPr>
+                <w:rFonts w:ascii="Arial" w:hAnsi="Arial" w:cs="Arial"/>
+                <w:noProof/>
+                <w:webHidden/>
+              </w:rPr>
+              <w:fldChar w:fldCharType="begin"/>
+            </w:r>
+            <w:r>
+              <w:rPr>
+                <w:rFonts w:ascii="Arial" w:hAnsi="Arial" w:cs="Arial"/>
+                <w:noProof/>
+                <w:webHidden/>
+              </w:rPr>
+              <w:instrText xml:space="preserve"> PAGEREF _Toc_auto_2_5_1 \h </w:instrText>
+            </w:r>
+            <w:r>
+              <w:rPr>
+                <w:rFonts w:ascii="Arial" w:hAnsi="Arial" w:cs="Arial"/>
+                <w:noProof/>
+                <w:webHidden/>
+              </w:rPr>
+              <w:fldChar w:fldCharType="separate"/>
+            </w:r>
+            <w:r>
+              <w:rPr>
+                <w:rFonts w:ascii="Arial" w:hAnsi="Arial" w:cs="Arial"/>
+                <w:noProof/>
+                <w:webHidden/>
+              </w:rPr>
+              <w:t>21</w:t>
+            </w:r>
+            <w:r>
+              <w:rPr>
+                <w:rFonts w:ascii="Arial" w:hAnsi="Arial" w:cs="Arial"/>
+                <w:noProof/>
+                <w:webHidden/>
+              </w:rPr>
+              <w:fldChar w:fldCharType="end"/>
+            </w:r>
+          </w:hyperlink>
+        </w:p>
+        <w:p>
+          <w:pPr>
+            <w:pStyle w:val="Sumrio2"/>
+            <w:tabs>
+              <w:tab w:val="left" w:pos="880"/>
+              <w:tab w:val="right" w:leader="dot" w:pos="9062"/>
+            </w:tabs>
+            <w:rPr>
+              <w:rFonts w:asciiTheme="minorHAnsi" w:eastAsiaTheme="minorEastAsia" w:hAnsiTheme="minorHAnsi" w:cstheme="minorBidi"/>
+              <w:noProof/>
+              <w:sz w:val="22"/>
+              <w:szCs w:val="22"/>
+            </w:rPr>
+          </w:pPr>
+          <w:hyperlink w:anchor="_Toc_auto_2_5_2" w:history="1">
+            <w:r>
+              <w:rPr>
+                <w:rFonts w:ascii="Arial" w:hAnsi="Arial" w:cs="Arial"/>
+                <w:rStyle w:val="Hyperlink"/>
+                <w:noProof/>
+              </w:rPr>
+              <w:t>5.2</w:t>
+            </w:r>
+            <w:r>
+              <w:rPr>
+                <w:rFonts w:asciiTheme="minorHAnsi" w:eastAsiaTheme="minorEastAsia" w:hAnsiTheme="minorHAnsi" w:cstheme="minorBidi" w:ascii="Arial" w:hAnsi="Arial" w:cs="Arial"/>
+                <w:noProof/>
+                <w:sz w:val="22"/>
+                <w:szCs w:val="22"/>
+              </w:rPr>
+              <w:tab/>
+            </w:r>
+            <w:r>
+              <w:rPr>
+                <w:rFonts w:ascii="Arial" w:hAnsi="Arial" w:cs="Arial"/>
+                <w:rStyle w:val="Hyperlink"/>
+                <w:noProof/>
+              </w:rPr>
+              <w:t>Módulo de Gestão da Grade de Provas (RF04, RNF02 e RNF06)</w:t>
+            </w:r>
+            <w:r>
+              <w:rPr>
+                <w:rFonts w:ascii="Arial" w:hAnsi="Arial" w:cs="Arial"/>
+                <w:noProof/>
+                <w:webHidden/>
+              </w:rPr>
+              <w:tab/>
+            </w:r>
+            <w:r>
+              <w:rPr>
+                <w:rFonts w:ascii="Arial" w:hAnsi="Arial" w:cs="Arial"/>
+                <w:noProof/>
+                <w:webHidden/>
+              </w:rPr>
+              <w:fldChar w:fldCharType="begin"/>
+            </w:r>
+            <w:r>
+              <w:rPr>
+                <w:rFonts w:ascii="Arial" w:hAnsi="Arial" w:cs="Arial"/>
+                <w:noProof/>
+                <w:webHidden/>
+              </w:rPr>
+              <w:instrText xml:space="preserve"> PAGEREF _Toc_auto_2_5_2 \h </w:instrText>
+            </w:r>
+            <w:r>
+              <w:rPr>
+                <w:rFonts w:ascii="Arial" w:hAnsi="Arial" w:cs="Arial"/>
+                <w:noProof/>
+                <w:webHidden/>
+              </w:rPr>
+              <w:fldChar w:fldCharType="separate"/>
+            </w:r>
+            <w:r>
+              <w:rPr>
+                <w:rFonts w:ascii="Arial" w:hAnsi="Arial" w:cs="Arial"/>
+                <w:noProof/>
+                <w:webHidden/>
+              </w:rPr>
+              <w:t>22</w:t>
+            </w:r>
+            <w:r>
+              <w:rPr>
+                <w:rFonts w:ascii="Arial" w:hAnsi="Arial" w:cs="Arial"/>
+                <w:noProof/>
+                <w:webHidden/>
+              </w:rPr>
+              <w:fldChar w:fldCharType="end"/>
+            </w:r>
+          </w:hyperlink>
+        </w:p>
+        <w:p>
+          <w:pPr>
+            <w:pStyle w:val="Sumrio2"/>
+            <w:tabs>
+              <w:tab w:val="left" w:pos="880"/>
+              <w:tab w:val="right" w:leader="dot" w:pos="9062"/>
+            </w:tabs>
+            <w:rPr>
+              <w:rFonts w:asciiTheme="minorHAnsi" w:eastAsiaTheme="minorEastAsia" w:hAnsiTheme="minorHAnsi" w:cstheme="minorBidi"/>
+              <w:noProof/>
+              <w:sz w:val="22"/>
+              <w:szCs w:val="22"/>
+            </w:rPr>
+          </w:pPr>
+          <w:hyperlink w:anchor="_Toc_auto_2_5_3" w:history="1">
+            <w:r>
+              <w:rPr>
+                <w:rFonts w:ascii="Arial" w:hAnsi="Arial" w:cs="Arial"/>
+                <w:rStyle w:val="Hyperlink"/>
+                <w:noProof/>
+              </w:rPr>
+              <w:t>5.3</w:t>
+            </w:r>
+            <w:r>
+              <w:rPr>
+                <w:rFonts w:asciiTheme="minorHAnsi" w:eastAsiaTheme="minorEastAsia" w:hAnsiTheme="minorHAnsi" w:cstheme="minorBidi" w:ascii="Arial" w:hAnsi="Arial" w:cs="Arial"/>
+                <w:noProof/>
+                <w:sz w:val="22"/>
+                <w:szCs w:val="22"/>
+              </w:rPr>
+              <w:tab/>
+            </w:r>
+            <w:r>
+              <w:rPr>
+                <w:rFonts w:ascii="Arial" w:hAnsi="Arial" w:cs="Arial"/>
+                <w:rStyle w:val="Hyperlink"/>
+                <w:noProof/>
+              </w:rPr>
+              <w:t>Módulo de Plantel de Remadores (RF03, RNF01 e RNF05)</w:t>
+            </w:r>
+            <w:r>
+              <w:rPr>
+                <w:rFonts w:ascii="Arial" w:hAnsi="Arial" w:cs="Arial"/>
+                <w:noProof/>
+                <w:webHidden/>
+              </w:rPr>
+              <w:tab/>
+            </w:r>
+            <w:r>
+              <w:rPr>
+                <w:rFonts w:ascii="Arial" w:hAnsi="Arial" w:cs="Arial"/>
+                <w:noProof/>
+                <w:webHidden/>
+              </w:rPr>
+              <w:fldChar w:fldCharType="begin"/>
+            </w:r>
+            <w:r>
+              <w:rPr>
+                <w:rFonts w:ascii="Arial" w:hAnsi="Arial" w:cs="Arial"/>
+                <w:noProof/>
+                <w:webHidden/>
+              </w:rPr>
+              <w:instrText xml:space="preserve"> PAGEREF _Toc_auto_2_5_3 \h </w:instrText>
+            </w:r>
+            <w:r>
+              <w:rPr>
+                <w:rFonts w:ascii="Arial" w:hAnsi="Arial" w:cs="Arial"/>
+                <w:noProof/>
+                <w:webHidden/>
+              </w:rPr>
+              <w:fldChar w:fldCharType="separate"/>
+            </w:r>
+            <w:r>
+              <w:rPr>
+                <w:rFonts w:ascii="Arial" w:hAnsi="Arial" w:cs="Arial"/>
+                <w:noProof/>
+                <w:webHidden/>
+              </w:rPr>
+              <w:t>22</w:t>
+            </w:r>
+            <w:r>
+              <w:rPr>
+                <w:rFonts w:ascii="Arial" w:hAnsi="Arial" w:cs="Arial"/>
+                <w:noProof/>
+                <w:webHidden/>
+              </w:rPr>
+              <w:fldChar w:fldCharType="end"/>
+            </w:r>
+          </w:hyperlink>
+        </w:p>
+        <w:p>
+          <w:pPr>
+            <w:pStyle w:val="Sumrio2"/>
+            <w:tabs>
+              <w:tab w:val="left" w:pos="880"/>
+              <w:tab w:val="right" w:leader="dot" w:pos="9062"/>
+            </w:tabs>
+            <w:rPr>
+              <w:rFonts w:asciiTheme="minorHAnsi" w:eastAsiaTheme="minorEastAsia" w:hAnsiTheme="minorHAnsi" w:cstheme="minorBidi"/>
+              <w:noProof/>
+              <w:sz w:val="22"/>
+              <w:szCs w:val="22"/>
+            </w:rPr>
+          </w:pPr>
+          <w:hyperlink w:anchor="_Toc_auto_2_5_4" w:history="1">
+            <w:r>
+              <w:rPr>
+                <w:rFonts w:ascii="Arial" w:hAnsi="Arial" w:cs="Arial"/>
+                <w:rStyle w:val="Hyperlink"/>
+                <w:noProof/>
+              </w:rPr>
+              <w:t>5.4</w:t>
+            </w:r>
+            <w:r>
+              <w:rPr>
+                <w:rFonts w:asciiTheme="minorHAnsi" w:eastAsiaTheme="minorEastAsia" w:hAnsiTheme="minorHAnsi" w:cstheme="minorBidi" w:ascii="Arial" w:hAnsi="Arial" w:cs="Arial"/>
+                <w:noProof/>
+                <w:sz w:val="22"/>
+                <w:szCs w:val="22"/>
+              </w:rPr>
+              <w:tab/>
+            </w:r>
+            <w:r>
+              <w:rPr>
+                <w:rFonts w:ascii="Arial" w:hAnsi="Arial" w:cs="Arial"/>
+                <w:rStyle w:val="Hyperlink"/>
+                <w:noProof/>
+              </w:rPr>
+              <w:t>Motor de Regras Manuais: Bloqueio e Fixação (RF05 e RF06)</w:t>
+            </w:r>
+            <w:r>
+              <w:rPr>
+                <w:rFonts w:ascii="Arial" w:hAnsi="Arial" w:cs="Arial"/>
+                <w:noProof/>
+                <w:webHidden/>
+              </w:rPr>
+              <w:tab/>
+            </w:r>
+            <w:r>
+              <w:rPr>
+                <w:rFonts w:ascii="Arial" w:hAnsi="Arial" w:cs="Arial"/>
+                <w:noProof/>
+                <w:webHidden/>
+              </w:rPr>
+              <w:fldChar w:fldCharType="begin"/>
+            </w:r>
+            <w:r>
+              <w:rPr>
+                <w:rFonts w:ascii="Arial" w:hAnsi="Arial" w:cs="Arial"/>
+                <w:noProof/>
+                <w:webHidden/>
+              </w:rPr>
+              <w:instrText xml:space="preserve"> PAGEREF _Toc_auto_2_5_4 \h </w:instrText>
+            </w:r>
+            <w:r>
+              <w:rPr>
+                <w:rFonts w:ascii="Arial" w:hAnsi="Arial" w:cs="Arial"/>
+                <w:noProof/>
+                <w:webHidden/>
+              </w:rPr>
+              <w:fldChar w:fldCharType="separate"/>
+            </w:r>
+            <w:r>
+              <w:rPr>
+                <w:rFonts w:ascii="Arial" w:hAnsi="Arial" w:cs="Arial"/>
+                <w:noProof/>
+                <w:webHidden/>
+              </w:rPr>
+              <w:t>23</w:t>
+            </w:r>
+            <w:r>
+              <w:rPr>
+                <w:rFonts w:ascii="Arial" w:hAnsi="Arial" w:cs="Arial"/>
+                <w:noProof/>
+                <w:webHidden/>
+              </w:rPr>
+              <w:fldChar w:fldCharType="end"/>
+            </w:r>
+          </w:hyperlink>
+        </w:p>
+        <w:p>
+          <w:pPr>
+            <w:pStyle w:val="Sumrio2"/>
+            <w:tabs>
+              <w:tab w:val="left" w:pos="880"/>
+              <w:tab w:val="right" w:leader="dot" w:pos="9062"/>
+            </w:tabs>
+            <w:rPr>
+              <w:rFonts w:asciiTheme="minorHAnsi" w:eastAsiaTheme="minorEastAsia" w:hAnsiTheme="minorHAnsi" w:cstheme="minorBidi"/>
+              <w:noProof/>
+              <w:sz w:val="22"/>
+              <w:szCs w:val="22"/>
+            </w:rPr>
+          </w:pPr>
+          <w:hyperlink w:anchor="_Toc_auto_2_5_5" w:history="1">
+            <w:r>
+              <w:rPr>
+                <w:rFonts w:ascii="Arial" w:hAnsi="Arial" w:cs="Arial"/>
+                <w:rStyle w:val="Hyperlink"/>
+                <w:noProof/>
+              </w:rPr>
+              <w:t>5.5</w:t>
+            </w:r>
+            <w:r>
+              <w:rPr>
+                <w:rFonts w:asciiTheme="minorHAnsi" w:eastAsiaTheme="minorEastAsia" w:hAnsiTheme="minorHAnsi" w:cstheme="minorBidi" w:ascii="Arial" w:hAnsi="Arial" w:cs="Arial"/>
+                <w:noProof/>
+                <w:sz w:val="22"/>
+                <w:szCs w:val="22"/>
+              </w:rPr>
+              <w:tab/>
+            </w:r>
+            <w:r>
+              <w:rPr>
+                <w:rFonts w:ascii="Arial" w:hAnsi="Arial" w:cs="Arial"/>
+                <w:rStyle w:val="Hyperlink"/>
+                <w:noProof/>
+              </w:rPr>
+              <w:t>Validação Pré-Voo e Execução da Otimização Matemática (RF07, RF08 e RNF07/08)</w:t>
+            </w:r>
+            <w:r>
+              <w:rPr>
+                <w:rFonts w:ascii="Arial" w:hAnsi="Arial" w:cs="Arial"/>
+                <w:noProof/>
+                <w:webHidden/>
+              </w:rPr>
+              <w:tab/>
+            </w:r>
+            <w:r>
+              <w:rPr>
+                <w:rFonts w:ascii="Arial" w:hAnsi="Arial" w:cs="Arial"/>
+                <w:noProof/>
+                <w:webHidden/>
+              </w:rPr>
+              <w:fldChar w:fldCharType="begin"/>
+            </w:r>
+            <w:r>
+              <w:rPr>
+                <w:rFonts w:ascii="Arial" w:hAnsi="Arial" w:cs="Arial"/>
+                <w:noProof/>
+                <w:webHidden/>
+              </w:rPr>
+              <w:instrText xml:space="preserve"> PAGEREF _Toc_auto_2_5_5 \h </w:instrText>
+            </w:r>
+            <w:r>
+              <w:rPr>
+                <w:rFonts w:ascii="Arial" w:hAnsi="Arial" w:cs="Arial"/>
+                <w:noProof/>
+                <w:webHidden/>
+              </w:rPr>
+              <w:fldChar w:fldCharType="separate"/>
+            </w:r>
+            <w:r>
+              <w:rPr>
+                <w:rFonts w:ascii="Arial" w:hAnsi="Arial" w:cs="Arial"/>
+                <w:noProof/>
+                <w:webHidden/>
+              </w:rPr>
+              <w:t>23</w:t>
+            </w:r>
+            <w:r>
+              <w:rPr>
+                <w:rFonts w:ascii="Arial" w:hAnsi="Arial" w:cs="Arial"/>
+                <w:noProof/>
+                <w:webHidden/>
+              </w:rPr>
+              <w:fldChar w:fldCharType="end"/>
+            </w:r>
+          </w:hyperlink>
+        </w:p>
+        <w:p>
+          <w:pPr>
+            <w:pStyle w:val="Sumrio2"/>
+            <w:tabs>
+              <w:tab w:val="left" w:pos="880"/>
+              <w:tab w:val="right" w:leader="dot" w:pos="9062"/>
+            </w:tabs>
+            <w:rPr>
+              <w:rFonts w:asciiTheme="minorHAnsi" w:eastAsiaTheme="minorEastAsia" w:hAnsiTheme="minorHAnsi" w:cstheme="minorBidi"/>
+              <w:noProof/>
+              <w:sz w:val="22"/>
+              <w:szCs w:val="22"/>
+            </w:rPr>
+          </w:pPr>
+          <w:hyperlink w:anchor="_Toc_auto_2_5_6" w:history="1">
+            <w:r>
+              <w:rPr>
+                <w:rFonts w:ascii="Arial" w:hAnsi="Arial" w:cs="Arial"/>
+                <w:rStyle w:val="Hyperlink"/>
+                <w:noProof/>
+              </w:rPr>
+              <w:t>5.6</w:t>
+            </w:r>
+            <w:r>
+              <w:rPr>
+                <w:rFonts w:asciiTheme="minorHAnsi" w:eastAsiaTheme="minorEastAsia" w:hAnsiTheme="minorHAnsi" w:cstheme="minorBidi" w:ascii="Arial" w:hAnsi="Arial" w:cs="Arial"/>
+                <w:noProof/>
+                <w:sz w:val="22"/>
+                <w:szCs w:val="22"/>
+              </w:rPr>
+              <w:tab/>
+            </w:r>
+            <w:r>
+              <w:rPr>
+                <w:rFonts w:ascii="Arial" w:hAnsi="Arial" w:cs="Arial"/>
+                <w:rStyle w:val="Hyperlink"/>
+                <w:noProof/>
+              </w:rPr>
+              <w:t>Central de Ajuda e Manual de Operação Integrado</w:t>
+            </w:r>
+            <w:r>
+              <w:rPr>
+                <w:rFonts w:ascii="Arial" w:hAnsi="Arial" w:cs="Arial"/>
+                <w:noProof/>
+                <w:webHidden/>
+              </w:rPr>
+              <w:tab/>
+            </w:r>
+            <w:r>
+              <w:rPr>
+                <w:rFonts w:ascii="Arial" w:hAnsi="Arial" w:cs="Arial"/>
+                <w:noProof/>
+                <w:webHidden/>
+              </w:rPr>
+              <w:fldChar w:fldCharType="begin"/>
+            </w:r>
+            <w:r>
+              <w:rPr>
+                <w:rFonts w:ascii="Arial" w:hAnsi="Arial" w:cs="Arial"/>
+                <w:noProof/>
+                <w:webHidden/>
+              </w:rPr>
+              <w:instrText xml:space="preserve"> PAGEREF _Toc_auto_2_5_6 \h </w:instrText>
+            </w:r>
+            <w:r>
+              <w:rPr>
+                <w:rFonts w:ascii="Arial" w:hAnsi="Arial" w:cs="Arial"/>
+                <w:noProof/>
+                <w:webHidden/>
+              </w:rPr>
+              <w:fldChar w:fldCharType="separate"/>
+            </w:r>
+            <w:r>
+              <w:rPr>
+                <w:rFonts w:ascii="Arial" w:hAnsi="Arial" w:cs="Arial"/>
+                <w:noProof/>
+                <w:webHidden/>
+              </w:rPr>
+              <w:t>24</w:t>
+            </w:r>
+            <w:r>
+              <w:rPr>
+                <w:rFonts w:ascii="Arial" w:hAnsi="Arial" w:cs="Arial"/>
+                <w:noProof/>
+                <w:webHidden/>
+              </w:rPr>
+              <w:fldChar w:fldCharType="end"/>
+            </w:r>
+          </w:hyperlink>
+        </w:p>
+        <w:p>
+          <w:pPr>
+            <w:pStyle w:val="Sumrio1"/>
+            <w:tabs>
+              <w:tab w:val="left" w:pos="440"/>
+              <w:tab w:val="right" w:leader="dot" w:pos="9062"/>
+            </w:tabs>
+            <w:rPr>
+              <w:rFonts w:asciiTheme="minorHAnsi" w:eastAsiaTheme="minorEastAsia" w:hAnsiTheme="minorHAnsi" w:cstheme="minorBidi"/>
+              <w:noProof/>
+              <w:sz w:val="22"/>
+              <w:szCs w:val="22"/>
+            </w:rPr>
+          </w:pPr>
+          <w:hyperlink w:anchor="_Toc_auto_1_6" w:history="1">
+            <w:r>
+              <w:rPr>
+                <w:rFonts w:ascii="Arial" w:hAnsi="Arial" w:cs="Arial"/>
+                <w:rStyle w:val="Hyperlink"/>
+                <w:noProof/>
+              </w:rPr>
+              <w:t>6</w:t>
+            </w:r>
+            <w:r>
+              <w:rPr>
+                <w:rFonts w:asciiTheme="minorHAnsi" w:eastAsiaTheme="minorEastAsia" w:hAnsiTheme="minorHAnsi" w:cstheme="minorBidi" w:ascii="Arial" w:hAnsi="Arial" w:cs="Arial"/>
+                <w:noProof/>
+                <w:sz w:val="22"/>
+                <w:szCs w:val="22"/>
+              </w:rPr>
+              <w:tab/>
+            </w:r>
+            <w:r>
+              <w:rPr>
+                <w:rFonts w:ascii="Arial" w:hAnsi="Arial" w:cs="Arial"/>
+                <w:rStyle w:val="Hyperlink"/>
+                <w:noProof/>
+              </w:rPr>
+              <w:t>TESTES E VALIDAÇÃO DOS RESULTADOS</w:t>
+            </w:r>
+            <w:r>
+              <w:rPr>
+                <w:rFonts w:ascii="Arial" w:hAnsi="Arial" w:cs="Arial"/>
+                <w:noProof/>
+                <w:webHidden/>
+              </w:rPr>
+              <w:tab/>
+            </w:r>
+            <w:r>
+              <w:rPr>
+                <w:rFonts w:ascii="Arial" w:hAnsi="Arial" w:cs="Arial"/>
+                <w:noProof/>
+                <w:webHidden/>
+              </w:rPr>
+              <w:fldChar w:fldCharType="begin"/>
+            </w:r>
+            <w:r>
+              <w:rPr>
+                <w:rFonts w:ascii="Arial" w:hAnsi="Arial" w:cs="Arial"/>
+                <w:noProof/>
+                <w:webHidden/>
+              </w:rPr>
+              <w:instrText xml:space="preserve"> PAGEREF _Toc_auto_1_6 \h </w:instrText>
+            </w:r>
+            <w:r>
+              <w:rPr>
+                <w:rFonts w:ascii="Arial" w:hAnsi="Arial" w:cs="Arial"/>
+                <w:noProof/>
+                <w:webHidden/>
+              </w:rPr>
+              <w:fldChar w:fldCharType="separate"/>
+            </w:r>
+            <w:r>
+              <w:rPr>
+                <w:rFonts w:ascii="Arial" w:hAnsi="Arial" w:cs="Arial"/>
+                <w:noProof/>
+                <w:webHidden/>
+              </w:rPr>
+              <w:t>25</w:t>
+            </w:r>
+            <w:r>
+              <w:rPr>
+                <w:rFonts w:ascii="Arial" w:hAnsi="Arial" w:cs="Arial"/>
+                <w:noProof/>
+                <w:webHidden/>
+              </w:rPr>
+              <w:fldChar w:fldCharType="end"/>
+            </w:r>
+          </w:hyperlink>
+        </w:p>
+        <w:p>
+          <w:pPr>
+            <w:pStyle w:val="Sumrio2"/>
+            <w:tabs>
+              <w:tab w:val="left" w:pos="880"/>
+              <w:tab w:val="right" w:leader="dot" w:pos="9062"/>
+            </w:tabs>
+            <w:rPr>
+              <w:rFonts w:asciiTheme="minorHAnsi" w:eastAsiaTheme="minorEastAsia" w:hAnsiTheme="minorHAnsi" w:cstheme="minorBidi"/>
+              <w:noProof/>
+              <w:sz w:val="22"/>
+              <w:szCs w:val="22"/>
+            </w:rPr>
+          </w:pPr>
+          <w:hyperlink w:anchor="_Toc_auto_2_6_1" w:history="1">
+            <w:r>
+              <w:rPr>
+                <w:rFonts w:ascii="Arial" w:hAnsi="Arial" w:cs="Arial"/>
+                <w:rStyle w:val="Hyperlink"/>
+                <w:noProof/>
+              </w:rPr>
+              <w:t>6.1</w:t>
+            </w:r>
+            <w:r>
+              <w:rPr>
+                <w:rFonts w:asciiTheme="minorHAnsi" w:eastAsiaTheme="minorEastAsia" w:hAnsiTheme="minorHAnsi" w:cstheme="minorBidi" w:ascii="Arial" w:hAnsi="Arial" w:cs="Arial"/>
+                <w:noProof/>
+                <w:sz w:val="22"/>
+                <w:szCs w:val="22"/>
+              </w:rPr>
+              <w:tab/>
+            </w:r>
+            <w:r>
+              <w:rPr>
+                <w:rFonts w:ascii="Arial" w:hAnsi="Arial" w:cs="Arial"/>
+                <w:rStyle w:val="Hyperlink"/>
+                <w:noProof/>
+              </w:rPr>
+              <w:t>Descrição da Massa de Testes e Cenário Experimental</w:t>
+            </w:r>
+            <w:r>
+              <w:rPr>
+                <w:rFonts w:ascii="Arial" w:hAnsi="Arial" w:cs="Arial"/>
+                <w:noProof/>
+                <w:webHidden/>
+              </w:rPr>
+              <w:tab/>
+            </w:r>
+            <w:r>
+              <w:rPr>
+                <w:rFonts w:ascii="Arial" w:hAnsi="Arial" w:cs="Arial"/>
+                <w:noProof/>
+                <w:webHidden/>
+              </w:rPr>
+              <w:fldChar w:fldCharType="begin"/>
+            </w:r>
+            <w:r>
+              <w:rPr>
+                <w:rFonts w:ascii="Arial" w:hAnsi="Arial" w:cs="Arial"/>
+                <w:noProof/>
+                <w:webHidden/>
+              </w:rPr>
+              <w:instrText xml:space="preserve"> PAGEREF _Toc_auto_2_6_1 \h </w:instrText>
+            </w:r>
+            <w:r>
+              <w:rPr>
+                <w:rFonts w:ascii="Arial" w:hAnsi="Arial" w:cs="Arial"/>
+                <w:noProof/>
+                <w:webHidden/>
+              </w:rPr>
+              <w:fldChar w:fldCharType="separate"/>
+            </w:r>
+            <w:r>
+              <w:rPr>
+                <w:rFonts w:ascii="Arial" w:hAnsi="Arial" w:cs="Arial"/>
+                <w:noProof/>
+                <w:webHidden/>
+              </w:rPr>
+              <w:t>25</w:t>
+            </w:r>
+            <w:r>
+              <w:rPr>
+                <w:rFonts w:ascii="Arial" w:hAnsi="Arial" w:cs="Arial"/>
+                <w:noProof/>
+                <w:webHidden/>
+              </w:rPr>
+              <w:fldChar w:fldCharType="end"/>
+            </w:r>
+          </w:hyperlink>
+        </w:p>
+        <w:p>
+          <w:pPr>
+            <w:pStyle w:val="Sumrio2"/>
+            <w:tabs>
+              <w:tab w:val="left" w:pos="880"/>
+              <w:tab w:val="right" w:leader="dot" w:pos="9062"/>
+            </w:tabs>
+            <w:rPr>
+              <w:rFonts w:asciiTheme="minorHAnsi" w:eastAsiaTheme="minorEastAsia" w:hAnsiTheme="minorHAnsi" w:cstheme="minorBidi"/>
+              <w:noProof/>
+              <w:sz w:val="22"/>
+              <w:szCs w:val="22"/>
+            </w:rPr>
+          </w:pPr>
+          <w:hyperlink w:anchor="_Toc_auto_2_6_2" w:history="1">
+            <w:r>
+              <w:rPr>
+                <w:rFonts w:ascii="Arial" w:hAnsi="Arial" w:cs="Arial"/>
+                <w:rStyle w:val="Hyperlink"/>
+                <w:noProof/>
+              </w:rPr>
+              <w:t>6.2</w:t>
+            </w:r>
+            <w:r>
+              <w:rPr>
+                <w:rFonts w:asciiTheme="minorHAnsi" w:eastAsiaTheme="minorEastAsia" w:hAnsiTheme="minorHAnsi" w:cstheme="minorBidi" w:ascii="Arial" w:hAnsi="Arial" w:cs="Arial"/>
+                <w:noProof/>
+                <w:sz w:val="22"/>
+                <w:szCs w:val="22"/>
+              </w:rPr>
+              <w:tab/>
+            </w:r>
+            <w:r>
+              <w:rPr>
+                <w:rFonts w:ascii="Arial" w:hAnsi="Arial" w:cs="Arial"/>
+                <w:rStyle w:val="Hyperlink"/>
+                <w:noProof/>
+              </w:rPr>
+              <w:t>Avaliação da Otimização e Fidelidade Matemática</w:t>
+            </w:r>
+            <w:r>
+              <w:rPr>
+                <w:rFonts w:ascii="Arial" w:hAnsi="Arial" w:cs="Arial"/>
+                <w:noProof/>
+                <w:webHidden/>
+              </w:rPr>
+              <w:tab/>
+            </w:r>
+            <w:r>
+              <w:rPr>
+                <w:rFonts w:ascii="Arial" w:hAnsi="Arial" w:cs="Arial"/>
+                <w:noProof/>
+                <w:webHidden/>
+              </w:rPr>
+              <w:fldChar w:fldCharType="begin"/>
+            </w:r>
+            <w:r>
+              <w:rPr>
+                <w:rFonts w:ascii="Arial" w:hAnsi="Arial" w:cs="Arial"/>
+                <w:noProof/>
+                <w:webHidden/>
+              </w:rPr>
+              <w:instrText xml:space="preserve"> PAGEREF _Toc_auto_2_6_2 \h </w:instrText>
+            </w:r>
+            <w:r>
+              <w:rPr>
+                <w:rFonts w:ascii="Arial" w:hAnsi="Arial" w:cs="Arial"/>
+                <w:noProof/>
+                <w:webHidden/>
+              </w:rPr>
+              <w:fldChar w:fldCharType="separate"/>
+            </w:r>
+            <w:r>
+              <w:rPr>
+                <w:rFonts w:ascii="Arial" w:hAnsi="Arial" w:cs="Arial"/>
+                <w:noProof/>
+                <w:webHidden/>
+              </w:rPr>
+              <w:t>26</w:t>
+            </w:r>
+            <w:r>
+              <w:rPr>
+                <w:rFonts w:ascii="Arial" w:hAnsi="Arial" w:cs="Arial"/>
+                <w:noProof/>
+                <w:webHidden/>
+              </w:rPr>
+              <w:fldChar w:fldCharType="end"/>
+            </w:r>
+          </w:hyperlink>
+        </w:p>
+        <w:p>
+          <w:pPr>
+            <w:pStyle w:val="Sumrio2"/>
+            <w:tabs>
+              <w:tab w:val="left" w:pos="880"/>
+              <w:tab w:val="right" w:leader="dot" w:pos="9062"/>
+            </w:tabs>
+            <w:rPr>
+              <w:rFonts w:asciiTheme="minorHAnsi" w:eastAsiaTheme="minorEastAsia" w:hAnsiTheme="minorHAnsi" w:cstheme="minorBidi"/>
+              <w:noProof/>
+              <w:sz w:val="22"/>
+              <w:szCs w:val="22"/>
+            </w:rPr>
+          </w:pPr>
+          <w:hyperlink w:anchor="_Toc_auto_2_6_3" w:history="1">
+            <w:r>
+              <w:rPr>
+                <w:rFonts w:ascii="Arial" w:hAnsi="Arial" w:cs="Arial"/>
+                <w:rStyle w:val="Hyperlink"/>
+                <w:noProof/>
+              </w:rPr>
+              <w:t>6.3</w:t>
+            </w:r>
+            <w:r>
+              <w:rPr>
+                <w:rFonts w:asciiTheme="minorHAnsi" w:eastAsiaTheme="minorEastAsia" w:hAnsiTheme="minorHAnsi" w:cstheme="minorBidi" w:ascii="Arial" w:hAnsi="Arial" w:cs="Arial"/>
+                <w:noProof/>
+                <w:sz w:val="22"/>
+                <w:szCs w:val="22"/>
+              </w:rPr>
+              <w:tab/>
+            </w:r>
+            <w:r>
+              <w:rPr>
+                <w:rFonts w:ascii="Arial" w:hAnsi="Arial" w:cs="Arial"/>
+                <w:rStyle w:val="Hyperlink"/>
+                <w:noProof/>
+              </w:rPr>
+              <w:t>Comparativo entre a Alocação Manual e a Solução Otimizada</w:t>
+            </w:r>
+            <w:r>
+              <w:rPr>
+                <w:rFonts w:ascii="Arial" w:hAnsi="Arial" w:cs="Arial"/>
+                <w:noProof/>
+                <w:webHidden/>
+              </w:rPr>
+              <w:tab/>
+            </w:r>
+            <w:r>
+              <w:rPr>
+                <w:rFonts w:ascii="Arial" w:hAnsi="Arial" w:cs="Arial"/>
+                <w:noProof/>
+                <w:webHidden/>
+              </w:rPr>
+              <w:fldChar w:fldCharType="begin"/>
+            </w:r>
+            <w:r>
+              <w:rPr>
+                <w:rFonts w:ascii="Arial" w:hAnsi="Arial" w:cs="Arial"/>
+                <w:noProof/>
+                <w:webHidden/>
+              </w:rPr>
+              <w:instrText xml:space="preserve"> PAGEREF _Toc_auto_2_6_3 \h </w:instrText>
+            </w:r>
+            <w:r>
+              <w:rPr>
+                <w:rFonts w:ascii="Arial" w:hAnsi="Arial" w:cs="Arial"/>
+                <w:noProof/>
+                <w:webHidden/>
+              </w:rPr>
+              <w:fldChar w:fldCharType="separate"/>
+            </w:r>
+            <w:r>
+              <w:rPr>
+                <w:rFonts w:ascii="Arial" w:hAnsi="Arial" w:cs="Arial"/>
+                <w:noProof/>
+                <w:webHidden/>
+              </w:rPr>
+              <w:t>27</w:t>
+            </w:r>
+            <w:r>
+              <w:rPr>
+                <w:rFonts w:ascii="Arial" w:hAnsi="Arial" w:cs="Arial"/>
+                <w:noProof/>
+                <w:webHidden/>
+              </w:rPr>
+              <w:fldChar w:fldCharType="end"/>
+            </w:r>
+          </w:hyperlink>
+        </w:p>
+        <w:p>
+          <w:pPr>
+            <w:pStyle w:val="Sumrio2"/>
+            <w:tabs>
+              <w:tab w:val="left" w:pos="880"/>
+              <w:tab w:val="right" w:leader="dot" w:pos="9062"/>
+            </w:tabs>
+            <w:rPr>
+              <w:rFonts w:asciiTheme="minorHAnsi" w:eastAsiaTheme="minorEastAsia" w:hAnsiTheme="minorHAnsi" w:cstheme="minorBidi"/>
+              <w:noProof/>
+              <w:sz w:val="22"/>
+              <w:szCs w:val="22"/>
+            </w:rPr>
+          </w:pPr>
+          <w:hyperlink w:anchor="_Toc_auto_2_6_4" w:history="1">
+            <w:r>
+              <w:rPr>
+                <w:rFonts w:ascii="Arial" w:hAnsi="Arial" w:cs="Arial"/>
+                <w:rStyle w:val="Hyperlink"/>
+                <w:noProof/>
+              </w:rPr>
+              <w:t>6.4</w:t>
+            </w:r>
+            <w:r>
+              <w:rPr>
+                <w:rFonts w:asciiTheme="minorHAnsi" w:eastAsiaTheme="minorEastAsia" w:hAnsiTheme="minorHAnsi" w:cstheme="minorBidi" w:ascii="Arial" w:hAnsi="Arial" w:cs="Arial"/>
+                <w:noProof/>
+                <w:sz w:val="22"/>
+                <w:szCs w:val="22"/>
+              </w:rPr>
+              <w:tab/>
+            </w:r>
+            <w:r>
+              <w:rPr>
+                <w:rFonts w:ascii="Arial" w:hAnsi="Arial" w:cs="Arial"/>
+                <w:rStyle w:val="Hyperlink"/>
+                <w:noProof/>
+              </w:rPr>
+              <w:t>Avaliação de Usabilidade, Ergonomia e Responsividade Móvel</w:t>
+            </w:r>
+            <w:r>
+              <w:rPr>
+                <w:rFonts w:ascii="Arial" w:hAnsi="Arial" w:cs="Arial"/>
+                <w:noProof/>
+                <w:webHidden/>
+              </w:rPr>
+              <w:tab/>
+            </w:r>
+            <w:r>
+              <w:rPr>
+                <w:rFonts w:ascii="Arial" w:hAnsi="Arial" w:cs="Arial"/>
+                <w:noProof/>
+                <w:webHidden/>
+              </w:rPr>
+              <w:fldChar w:fldCharType="begin"/>
+            </w:r>
+            <w:r>
+              <w:rPr>
+                <w:rFonts w:ascii="Arial" w:hAnsi="Arial" w:cs="Arial"/>
+                <w:noProof/>
+                <w:webHidden/>
+              </w:rPr>
+              <w:instrText xml:space="preserve"> PAGEREF _Toc_auto_2_6_4 \h </w:instrText>
+            </w:r>
+            <w:r>
+              <w:rPr>
+                <w:rFonts w:ascii="Arial" w:hAnsi="Arial" w:cs="Arial"/>
+                <w:noProof/>
+                <w:webHidden/>
+              </w:rPr>
+              <w:fldChar w:fldCharType="separate"/>
+            </w:r>
+            <w:r>
+              <w:rPr>
+                <w:rFonts w:ascii="Arial" w:hAnsi="Arial" w:cs="Arial"/>
+                <w:noProof/>
+                <w:webHidden/>
+              </w:rPr>
+              <w:t>28</w:t>
+            </w:r>
+            <w:r>
+              <w:rPr>
+                <w:rFonts w:ascii="Arial" w:hAnsi="Arial" w:cs="Arial"/>
+                <w:noProof/>
+                <w:webHidden/>
+              </w:rPr>
+              <w:fldChar w:fldCharType="end"/>
+            </w:r>
+          </w:hyperlink>
+        </w:p>
+        <w:p>
+          <w:pPr>
+            <w:pStyle w:val="Sumrio1"/>
+            <w:tabs>
+              <w:tab w:val="left" w:pos="440"/>
+              <w:tab w:val="right" w:leader="dot" w:pos="9062"/>
+            </w:tabs>
+            <w:rPr>
+              <w:rFonts w:asciiTheme="minorHAnsi" w:eastAsiaTheme="minorEastAsia" w:hAnsiTheme="minorHAnsi" w:cstheme="minorBidi"/>
+              <w:noProof/>
+              <w:sz w:val="22"/>
+              <w:szCs w:val="22"/>
+            </w:rPr>
+          </w:pPr>
+          <w:hyperlink w:anchor="_Toc_auto_1_7" w:history="1">
+            <w:r>
+              <w:rPr>
+                <w:rFonts w:ascii="Arial" w:hAnsi="Arial" w:cs="Arial"/>
+                <w:rStyle w:val="Hyperlink"/>
+                <w:noProof/>
+              </w:rPr>
+              <w:t>7</w:t>
+            </w:r>
+            <w:r>
+              <w:rPr>
+                <w:rFonts w:asciiTheme="minorHAnsi" w:eastAsiaTheme="minorEastAsia" w:hAnsiTheme="minorHAnsi" w:cstheme="minorBidi" w:ascii="Arial" w:hAnsi="Arial" w:cs="Arial"/>
+                <w:noProof/>
+                <w:sz w:val="22"/>
+                <w:szCs w:val="22"/>
+              </w:rPr>
+              <w:tab/>
+            </w:r>
+            <w:r>
+              <w:rPr>
+                <w:rFonts w:ascii="Arial" w:hAnsi="Arial" w:cs="Arial"/>
+                <w:rStyle w:val="Hyperlink"/>
+                <w:noProof/>
+              </w:rPr>
+              <w:t>CONCLUSÃO E TRABALHOS FUTUROS</w:t>
+            </w:r>
+            <w:r>
+              <w:rPr>
+                <w:rFonts w:ascii="Arial" w:hAnsi="Arial" w:cs="Arial"/>
+                <w:noProof/>
+                <w:webHidden/>
+              </w:rPr>
+              <w:tab/>
+            </w:r>
+            <w:r>
+              <w:rPr>
+                <w:rFonts w:ascii="Arial" w:hAnsi="Arial" w:cs="Arial"/>
+                <w:noProof/>
+                <w:webHidden/>
+              </w:rPr>
+              <w:fldChar w:fldCharType="begin"/>
+            </w:r>
+            <w:r>
+              <w:rPr>
+                <w:rFonts w:ascii="Arial" w:hAnsi="Arial" w:cs="Arial"/>
+                <w:noProof/>
+                <w:webHidden/>
+              </w:rPr>
+              <w:instrText xml:space="preserve"> PAGEREF _Toc_auto_1_7 \h </w:instrText>
+            </w:r>
+            <w:r>
+              <w:rPr>
+                <w:rFonts w:ascii="Arial" w:hAnsi="Arial" w:cs="Arial"/>
+                <w:noProof/>
+                <w:webHidden/>
+              </w:rPr>
+              <w:fldChar w:fldCharType="separate"/>
+            </w:r>
+            <w:r>
+              <w:rPr>
+                <w:rFonts w:ascii="Arial" w:hAnsi="Arial" w:cs="Arial"/>
+                <w:noProof/>
+                <w:webHidden/>
+              </w:rPr>
+              <w:t>29</w:t>
+            </w:r>
+            <w:r>
+              <w:rPr>
+                <w:rFonts w:ascii="Arial" w:hAnsi="Arial" w:cs="Arial"/>
+                <w:noProof/>
+                <w:webHidden/>
+              </w:rPr>
+              <w:fldChar w:fldCharType="end"/>
+            </w:r>
+          </w:hyperlink>
+        </w:p>
         <w:p>
           <w:pPr>
             <w:keepNext w:val="0"/>
@@ -2820,25 +4899,7 @@
         <w:rPr/>
       </w:pPr>
       <w:r>
-        <w:rPr>
-          <w:rtl w:val="0"/>
-        </w:rPr>
-        <w:t xml:space="preserve">UX – </w:t>
-      </w:r>
-      <w:r>
-        <w:rPr>
-          <w:rFonts w:ascii="Arial" w:cs="Arial" w:eastAsia="Arial" w:hAnsi="Arial"/>
-          <w:i w:val="1"/>
-          <w:iCs w:val="1"/>
-          <w:rtl w:val="0"/>
-        </w:rPr>
-        <w:t xml:space="preserve">User Experience</w:t>
-      </w:r>
-      <w:r>
-        <w:rPr>
-          <w:rtl w:val="0"/>
-        </w:rPr>
-        <w:t xml:space="preserve"> (Experiência do Utilizador)</w:t>
+        <w:t>UX – User Experience (Experiência do Usuário)</w:t>
       </w:r>
     </w:p>
     <w:p>
@@ -8055,6 +10116,483 @@
     </w:p>
     <w:p>
       <w:pPr>
+        <w:spacing w:line="276" w:lineRule="auto" w:before="200" w:after="80"/>
+        <w:ind w:firstLine="0"/>
+        <w:jc w:val="center"/>
+      </w:pPr>
+      <w:r>
+        <w:rPr>
+          <w:rFonts w:ascii="Arial" w:hAnsi="Arial"/>
+          <w:b/>
+          <w:color w:val="000000"/>
+          <w:sz w:val="21"/>
+        </w:rPr>
+        <w:t>Quadro 1 – Rotina de Ingestão e Mapeamento de Arquivos CSV de Atletas (handleImportAtletasCSV)</w:t>
+      </w:r>
+    </w:p>
+    <w:tbl>
+      <w:tblPr>
+        <w:tblW w:type="auto" w:w="0"/>
+        <w:jc w:val="center"/>
+        <w:tblLook w:firstColumn="1" w:firstRow="1" w:lastColumn="0" w:lastRow="0" w:noHBand="0" w:noVBand="1" w:val="04A0"/>
+      </w:tblPr>
+      <w:tblGrid>
+        <w:gridCol w:w="9072"/>
+      </w:tblGrid>
+      <w:tr>
+        <w:tc>
+          <w:tcPr>
+            <w:tcW w:type="dxa" w:w="9360"/>
+            <w:shd w:fill="0F172A"/>
+            <w:tcMar>
+              <w:top w:w="140" w:type="dxa"/>
+              <w:bottom w:w="140" w:type="dxa"/>
+              <w:left w:w="200" w:type="dxa"/>
+              <w:right w:w="200" w:type="dxa"/>
+            </w:tcMar>
+          </w:tcPr>
+          <w:p>
+            <w:pPr>
+              <w:spacing w:line="252" w:lineRule="auto" w:before="0" w:after="40"/>
+              <w:ind w:firstLine="0"/>
+              <w:jc w:val="left"/>
+            </w:pPr>
+            <w:r/>
+            <w:r>
+              <w:rPr>
+                <w:rFonts w:ascii="Consolas" w:hAnsi="Consolas"/>
+                <w:color w:val="E2E8F0"/>
+                <w:sz w:val="19"/>
+              </w:rPr>
+              <w:t>// Leitura assíncrona, sanitização e mapeamento do plantel via CSV</w:t>
+            </w:r>
+          </w:p>
+          <w:p>
+            <w:pPr>
+              <w:spacing w:line="252" w:lineRule="auto" w:before="0" w:after="40"/>
+              <w:ind w:firstLine="0"/>
+              <w:jc w:val="left"/>
+            </w:pPr>
+            <w:r>
+              <w:rPr>
+                <w:rFonts w:ascii="Consolas" w:hAnsi="Consolas"/>
+                <w:color w:val="E2E8F0"/>
+                <w:sz w:val="19"/>
+              </w:rPr>
+              <w:t>const handleImportAtletasCSV = (e) =&gt; {</w:t>
+            </w:r>
+          </w:p>
+          <w:p>
+            <w:pPr>
+              <w:spacing w:line="252" w:lineRule="auto" w:before="0" w:after="40"/>
+              <w:ind w:firstLine="0"/>
+              <w:jc w:val="left"/>
+            </w:pPr>
+            <w:r>
+              <w:rPr>
+                <w:rFonts w:ascii="Consolas" w:hAnsi="Consolas"/>
+                <w:color w:val="E2E8F0"/>
+                <w:sz w:val="19"/>
+              </w:rPr>
+              <w:t xml:space="preserve">  const file = e.target.files[0];</w:t>
+            </w:r>
+          </w:p>
+          <w:p>
+            <w:pPr>
+              <w:spacing w:line="252" w:lineRule="auto" w:before="0" w:after="40"/>
+              <w:ind w:firstLine="0"/>
+              <w:jc w:val="left"/>
+            </w:pPr>
+            <w:r>
+              <w:rPr>
+                <w:rFonts w:ascii="Consolas" w:hAnsi="Consolas"/>
+                <w:color w:val="E2E8F0"/>
+                <w:sz w:val="19"/>
+              </w:rPr>
+              <w:t xml:space="preserve">  if (!file) return;</w:t>
+            </w:r>
+          </w:p>
+          <w:p>
+            <w:pPr>
+              <w:spacing w:line="252" w:lineRule="auto" w:before="0" w:after="40"/>
+              <w:ind w:firstLine="0"/>
+              <w:jc w:val="left"/>
+            </w:pPr>
+            <w:r>
+              <w:rPr>
+                <w:rFonts w:ascii="Consolas" w:hAnsi="Consolas"/>
+                <w:color w:val="E2E8F0"/>
+                <w:sz w:val="19"/>
+              </w:rPr>
+              <w:t xml:space="preserve">  const reader = new FileReader();</w:t>
+            </w:r>
+          </w:p>
+          <w:p>
+            <w:pPr>
+              <w:spacing w:line="252" w:lineRule="auto" w:before="0" w:after="40"/>
+              <w:ind w:firstLine="0"/>
+              <w:jc w:val="left"/>
+            </w:pPr>
+            <w:r>
+              <w:rPr>
+                <w:rFonts w:ascii="Consolas" w:hAnsi="Consolas"/>
+                <w:color w:val="E2E8F0"/>
+                <w:sz w:val="19"/>
+              </w:rPr>
+              <w:t xml:space="preserve">  reader.onload = (evt) =&gt; {</w:t>
+            </w:r>
+          </w:p>
+          <w:p>
+            <w:pPr>
+              <w:spacing w:line="252" w:lineRule="auto" w:before="0" w:after="40"/>
+              <w:ind w:firstLine="0"/>
+              <w:jc w:val="left"/>
+            </w:pPr>
+            <w:r>
+              <w:rPr>
+                <w:rFonts w:ascii="Consolas" w:hAnsi="Consolas"/>
+                <w:color w:val="E2E8F0"/>
+                <w:sz w:val="19"/>
+              </w:rPr>
+              <w:t xml:space="preserve">    const text = evt.target.result;</w:t>
+            </w:r>
+          </w:p>
+          <w:p>
+            <w:pPr>
+              <w:spacing w:line="252" w:lineRule="auto" w:before="0" w:after="40"/>
+              <w:ind w:firstLine="0"/>
+              <w:jc w:val="left"/>
+            </w:pPr>
+            <w:r>
+              <w:rPr>
+                <w:rFonts w:ascii="Consolas" w:hAnsi="Consolas"/>
+                <w:color w:val="E2E8F0"/>
+                <w:sz w:val="19"/>
+              </w:rPr>
+              <w:t xml:space="preserve">    const lines = text.split(/\r?\n/).map(l =&gt; l.trim()).filter(l =&gt; l.length &gt; 0);</w:t>
+            </w:r>
+          </w:p>
+          <w:p>
+            <w:pPr>
+              <w:spacing w:line="252" w:lineRule="auto" w:before="0" w:after="40"/>
+              <w:ind w:firstLine="0"/>
+              <w:jc w:val="left"/>
+            </w:pPr>
+            <w:r>
+              <w:rPr>
+                <w:rFonts w:ascii="Consolas" w:hAnsi="Consolas"/>
+                <w:color w:val="E2E8F0"/>
+                <w:sz w:val="19"/>
+              </w:rPr>
+              <w:t xml:space="preserve">    if (lines.length &lt; 2) return;</w:t>
+            </w:r>
+          </w:p>
+          <w:p>
+            <w:pPr>
+              <w:spacing w:line="252" w:lineRule="auto" w:before="0" w:after="40"/>
+              <w:ind w:firstLine="0"/>
+              <w:jc w:val="left"/>
+            </w:pPr>
+            <w:r>
+              <w:rPr>
+                <w:rFonts w:ascii="Consolas" w:hAnsi="Consolas"/>
+                <w:color w:val="E2E8F0"/>
+                <w:sz w:val="19"/>
+              </w:rPr>
+              <w:t xml:space="preserve">    const newAtletas = [];</w:t>
+            </w:r>
+          </w:p>
+          <w:p>
+            <w:pPr>
+              <w:spacing w:line="252" w:lineRule="auto" w:before="0" w:after="40"/>
+              <w:ind w:firstLine="0"/>
+              <w:jc w:val="left"/>
+            </w:pPr>
+            <w:r>
+              <w:rPr>
+                <w:rFonts w:ascii="Consolas" w:hAnsi="Consolas"/>
+                <w:color w:val="E2E8F0"/>
+                <w:sz w:val="19"/>
+              </w:rPr>
+              <w:t xml:space="preserve">    for (let i = 1; i &lt; lines.length; i++) {</w:t>
+            </w:r>
+          </w:p>
+          <w:p>
+            <w:pPr>
+              <w:spacing w:line="252" w:lineRule="auto" w:before="0" w:after="40"/>
+              <w:ind w:firstLine="0"/>
+              <w:jc w:val="left"/>
+            </w:pPr>
+            <w:r>
+              <w:rPr>
+                <w:rFonts w:ascii="Consolas" w:hAnsi="Consolas"/>
+                <w:color w:val="E2E8F0"/>
+                <w:sz w:val="19"/>
+              </w:rPr>
+              <w:t xml:space="preserve">      const parts = lines[i].split(/[;,]/).map(p =&gt; p.trim());</w:t>
+            </w:r>
+          </w:p>
+          <w:p>
+            <w:pPr>
+              <w:spacing w:line="252" w:lineRule="auto" w:before="0" w:after="40"/>
+              <w:ind w:firstLine="0"/>
+              <w:jc w:val="left"/>
+            </w:pPr>
+            <w:r>
+              <w:rPr>
+                <w:rFonts w:ascii="Consolas" w:hAnsi="Consolas"/>
+                <w:color w:val="E2E8F0"/>
+                <w:sz w:val="19"/>
+              </w:rPr>
+              <w:t xml:space="preserve">      if (parts.length &gt;= 6) {</w:t>
+            </w:r>
+          </w:p>
+          <w:p>
+            <w:pPr>
+              <w:spacing w:line="252" w:lineRule="auto" w:before="0" w:after="40"/>
+              <w:ind w:firstLine="0"/>
+              <w:jc w:val="left"/>
+            </w:pPr>
+            <w:r>
+              <w:rPr>
+                <w:rFonts w:ascii="Consolas" w:hAnsi="Consolas"/>
+                <w:color w:val="E2E8F0"/>
+                <w:sz w:val="19"/>
+              </w:rPr>
+              <w:t xml:space="preserve">        newAtletas.push({</w:t>
+            </w:r>
+          </w:p>
+          <w:p>
+            <w:pPr>
+              <w:spacing w:line="252" w:lineRule="auto" w:before="0" w:after="40"/>
+              <w:ind w:firstLine="0"/>
+              <w:jc w:val="left"/>
+            </w:pPr>
+            <w:r>
+              <w:rPr>
+                <w:rFonts w:ascii="Consolas" w:hAnsi="Consolas"/>
+                <w:color w:val="E2E8F0"/>
+                <w:sz w:val="19"/>
+              </w:rPr>
+              <w:t xml:space="preserve">          id: i,</w:t>
+            </w:r>
+          </w:p>
+          <w:p>
+            <w:pPr>
+              <w:spacing w:line="252" w:lineRule="auto" w:before="0" w:after="40"/>
+              <w:ind w:firstLine="0"/>
+              <w:jc w:val="left"/>
+            </w:pPr>
+            <w:r>
+              <w:rPr>
+                <w:rFonts w:ascii="Consolas" w:hAnsi="Consolas"/>
+                <w:color w:val="E2E8F0"/>
+                <w:sz w:val="19"/>
+              </w:rPr>
+              <w:t xml:space="preserve">          name: parts[0] || `Atleta ${i}`,</w:t>
+            </w:r>
+          </w:p>
+          <w:p>
+            <w:pPr>
+              <w:spacing w:line="252" w:lineRule="auto" w:before="0" w:after="40"/>
+              <w:ind w:firstLine="0"/>
+              <w:jc w:val="left"/>
+            </w:pPr>
+            <w:r>
+              <w:rPr>
+                <w:rFonts w:ascii="Consolas" w:hAnsi="Consolas"/>
+                <w:color w:val="E2E8F0"/>
+                <w:sz w:val="19"/>
+              </w:rPr>
+              <w:t xml:space="preserve">          min: parseInt(parts[1]) || 0,</w:t>
+            </w:r>
+          </w:p>
+          <w:p>
+            <w:pPr>
+              <w:spacing w:line="252" w:lineRule="auto" w:before="0" w:after="40"/>
+              <w:ind w:firstLine="0"/>
+              <w:jc w:val="left"/>
+            </w:pPr>
+            <w:r>
+              <w:rPr>
+                <w:rFonts w:ascii="Consolas" w:hAnsi="Consolas"/>
+                <w:color w:val="E2E8F0"/>
+                <w:sz w:val="19"/>
+              </w:rPr>
+              <w:t xml:space="preserve">          max: parseInt(parts[2]) || 3,</w:t>
+            </w:r>
+          </w:p>
+          <w:p>
+            <w:pPr>
+              <w:spacing w:line="252" w:lineRule="auto" w:before="0" w:after="40"/>
+              <w:ind w:firstLine="0"/>
+              <w:jc w:val="left"/>
+            </w:pPr>
+            <w:r>
+              <w:rPr>
+                <w:rFonts w:ascii="Consolas" w:hAnsi="Consolas"/>
+                <w:color w:val="E2E8F0"/>
+                <w:sz w:val="19"/>
+              </w:rPr>
+              <w:t xml:space="preserve">          sex: parts[3] || 'M',</w:t>
+            </w:r>
+          </w:p>
+          <w:p>
+            <w:pPr>
+              <w:spacing w:line="252" w:lineRule="auto" w:before="0" w:after="40"/>
+              <w:ind w:firstLine="0"/>
+              <w:jc w:val="left"/>
+            </w:pPr>
+            <w:r>
+              <w:rPr>
+                <w:rFonts w:ascii="Consolas" w:hAnsi="Consolas"/>
+                <w:color w:val="E2E8F0"/>
+                <w:sz w:val="19"/>
+              </w:rPr>
+              <w:t xml:space="preserve">          age: parseInt(parts[4]) || 30,</w:t>
+            </w:r>
+          </w:p>
+          <w:p>
+            <w:pPr>
+              <w:spacing w:line="252" w:lineRule="auto" w:before="0" w:after="40"/>
+              <w:ind w:firstLine="0"/>
+              <w:jc w:val="left"/>
+            </w:pPr>
+            <w:r>
+              <w:rPr>
+                <w:rFonts w:ascii="Consolas" w:hAnsi="Consolas"/>
+                <w:color w:val="E2E8F0"/>
+                <w:sz w:val="19"/>
+              </w:rPr>
+              <w:t xml:space="preserve">          score: parseFloat(parts[5].replace(',', '.')) || 0.5</w:t>
+            </w:r>
+          </w:p>
+          <w:p>
+            <w:pPr>
+              <w:spacing w:line="252" w:lineRule="auto" w:before="0" w:after="40"/>
+              <w:ind w:firstLine="0"/>
+              <w:jc w:val="left"/>
+            </w:pPr>
+            <w:r>
+              <w:rPr>
+                <w:rFonts w:ascii="Consolas" w:hAnsi="Consolas"/>
+                <w:color w:val="E2E8F0"/>
+                <w:sz w:val="19"/>
+              </w:rPr>
+              <w:t xml:space="preserve">        });</w:t>
+            </w:r>
+          </w:p>
+          <w:p>
+            <w:pPr>
+              <w:spacing w:line="252" w:lineRule="auto" w:before="0" w:after="40"/>
+              <w:ind w:firstLine="0"/>
+              <w:jc w:val="left"/>
+            </w:pPr>
+            <w:r>
+              <w:rPr>
+                <w:rFonts w:ascii="Consolas" w:hAnsi="Consolas"/>
+                <w:color w:val="E2E8F0"/>
+                <w:sz w:val="19"/>
+              </w:rPr>
+              <w:t xml:space="preserve">      }</w:t>
+            </w:r>
+          </w:p>
+          <w:p>
+            <w:pPr>
+              <w:spacing w:line="252" w:lineRule="auto" w:before="0" w:after="40"/>
+              <w:ind w:firstLine="0"/>
+              <w:jc w:val="left"/>
+            </w:pPr>
+            <w:r>
+              <w:rPr>
+                <w:rFonts w:ascii="Consolas" w:hAnsi="Consolas"/>
+                <w:color w:val="E2E8F0"/>
+                <w:sz w:val="19"/>
+              </w:rPr>
+              <w:t xml:space="preserve">    }</w:t>
+            </w:r>
+          </w:p>
+          <w:p>
+            <w:pPr>
+              <w:spacing w:line="252" w:lineRule="auto" w:before="0" w:after="40"/>
+              <w:ind w:firstLine="0"/>
+              <w:jc w:val="left"/>
+            </w:pPr>
+            <w:r>
+              <w:rPr>
+                <w:rFonts w:ascii="Consolas" w:hAnsi="Consolas"/>
+                <w:color w:val="E2E8F0"/>
+                <w:sz w:val="19"/>
+              </w:rPr>
+              <w:t xml:space="preserve">    if (newAtletas.length &gt; 0) setAtletas(newAtletas);</w:t>
+            </w:r>
+          </w:p>
+          <w:p>
+            <w:pPr>
+              <w:spacing w:line="252" w:lineRule="auto" w:before="0" w:after="40"/>
+              <w:ind w:firstLine="0"/>
+              <w:jc w:val="left"/>
+            </w:pPr>
+            <w:r>
+              <w:rPr>
+                <w:rFonts w:ascii="Consolas" w:hAnsi="Consolas"/>
+                <w:color w:val="E2E8F0"/>
+                <w:sz w:val="19"/>
+              </w:rPr>
+              <w:t xml:space="preserve">  };</w:t>
+            </w:r>
+          </w:p>
+          <w:p>
+            <w:pPr>
+              <w:spacing w:line="252" w:lineRule="auto" w:before="0" w:after="40"/>
+              <w:ind w:firstLine="0"/>
+              <w:jc w:val="left"/>
+            </w:pPr>
+            <w:r>
+              <w:rPr>
+                <w:rFonts w:ascii="Consolas" w:hAnsi="Consolas"/>
+                <w:color w:val="E2E8F0"/>
+                <w:sz w:val="19"/>
+              </w:rPr>
+              <w:t xml:space="preserve">  reader.readAsText(file);</w:t>
+            </w:r>
+          </w:p>
+          <w:p>
+            <w:pPr>
+              <w:spacing w:line="252" w:lineRule="auto" w:before="0" w:after="40"/>
+              <w:ind w:firstLine="0"/>
+              <w:jc w:val="left"/>
+            </w:pPr>
+            <w:r>
+              <w:rPr>
+                <w:rFonts w:ascii="Consolas" w:hAnsi="Consolas"/>
+                <w:color w:val="E2E8F0"/>
+                <w:sz w:val="19"/>
+              </w:rPr>
+              <w:t>};</w:t>
+            </w:r>
+          </w:p>
+        </w:tc>
+      </w:tr>
+    </w:tbl>
+    <w:p>
+      <w:pPr>
+        <w:spacing w:line="276" w:lineRule="auto" w:before="60" w:after="200"/>
+        <w:ind w:firstLine="0"/>
+        <w:jc w:val="center"/>
+      </w:pPr>
+      <w:r>
+        <w:rPr>
+          <w:rFonts w:ascii="Arial" w:hAnsi="Arial"/>
+          <w:i/>
+          <w:color w:val="475569"/>
+          <w:sz w:val="19"/>
+        </w:rPr>
+        <w:t>Fonte: Elaborado pelo autor a partir do código-fonte (App.jsx, linhas 353–378).</w:t>
+      </w:r>
+    </w:p>
+    <w:p>
+      <w:pPr>
         <w:pStyle w:val="Heading2"/>
         <w:numPr>
           <w:ilvl w:val="1"/>
@@ -8216,6 +10754,375 @@
     </w:p>
     <w:p>
       <w:pPr>
+        <w:spacing w:line="276" w:lineRule="auto" w:before="200" w:after="80"/>
+        <w:ind w:firstLine="0"/>
+        <w:jc w:val="center"/>
+      </w:pPr>
+      <w:r>
+        <w:rPr>
+          <w:rFonts w:ascii="Arial" w:hAnsi="Arial"/>
+          <w:b/>
+          <w:color w:val="000000"/>
+          <w:sz w:val="21"/>
+        </w:rPr>
+        <w:t>Quadro 2 – Rotina de Filtragem de Candidatos Elegíveis e Aplicação de Bloqueios (RF06)</w:t>
+      </w:r>
+    </w:p>
+    <w:tbl>
+      <w:tblPr>
+        <w:tblW w:type="auto" w:w="0"/>
+        <w:jc w:val="center"/>
+        <w:tblLook w:firstColumn="1" w:firstRow="1" w:lastColumn="0" w:lastRow="0" w:noHBand="0" w:noVBand="1" w:val="04A0"/>
+      </w:tblPr>
+      <w:tblGrid>
+        <w:gridCol w:w="9072"/>
+      </w:tblGrid>
+      <w:tr>
+        <w:tc>
+          <w:tcPr>
+            <w:tcW w:type="dxa" w:w="9360"/>
+            <w:shd w:fill="0F172A"/>
+            <w:tcMar>
+              <w:top w:w="140" w:type="dxa"/>
+              <w:bottom w:w="140" w:type="dxa"/>
+              <w:left w:w="200" w:type="dxa"/>
+              <w:right w:w="200" w:type="dxa"/>
+            </w:tcMar>
+          </w:tcPr>
+          <w:p>
+            <w:pPr>
+              <w:spacing w:line="252" w:lineRule="auto" w:before="0" w:after="40"/>
+              <w:ind w:firstLine="0"/>
+              <w:jc w:val="left"/>
+            </w:pPr>
+            <w:r/>
+            <w:r>
+              <w:rPr>
+                <w:rFonts w:ascii="Consolas" w:hAnsi="Consolas"/>
+                <w:color w:val="E2E8F0"/>
+                <w:sz w:val="19"/>
+              </w:rPr>
+              <w:t>// Filtragem de candidatos elegíveis respeitando regras manuais de bloqueio (RF06)</w:t>
+            </w:r>
+          </w:p>
+          <w:p>
+            <w:pPr>
+              <w:spacing w:line="252" w:lineRule="auto" w:before="0" w:after="40"/>
+              <w:ind w:firstLine="0"/>
+              <w:jc w:val="left"/>
+            </w:pPr>
+            <w:r>
+              <w:rPr>
+                <w:rFonts w:ascii="Consolas" w:hAnsi="Consolas"/>
+                <w:color w:val="E2E8F0"/>
+                <w:sz w:val="19"/>
+              </w:rPr>
+              <w:t>const candidates = inputAtletas.filter(atleta =&gt; {</w:t>
+            </w:r>
+          </w:p>
+          <w:p>
+            <w:pPr>
+              <w:spacing w:line="252" w:lineRule="auto" w:before="0" w:after="40"/>
+              <w:ind w:firstLine="0"/>
+              <w:jc w:val="left"/>
+            </w:pPr>
+            <w:r>
+              <w:rPr>
+                <w:rFonts w:ascii="Consolas" w:hAnsi="Consolas"/>
+                <w:color w:val="E2E8F0"/>
+                <w:sz w:val="19"/>
+              </w:rPr>
+              <w:t xml:space="preserve">  // 1. Não pode estar previamente alocado na tripulação</w:t>
+            </w:r>
+          </w:p>
+          <w:p>
+            <w:pPr>
+              <w:spacing w:line="252" w:lineRule="auto" w:before="0" w:after="40"/>
+              <w:ind w:firstLine="0"/>
+              <w:jc w:val="left"/>
+            </w:pPr>
+            <w:r>
+              <w:rPr>
+                <w:rFonts w:ascii="Consolas" w:hAnsi="Consolas"/>
+                <w:color w:val="E2E8F0"/>
+                <w:sz w:val="19"/>
+              </w:rPr>
+              <w:t xml:space="preserve">  if (crew.some(c =&gt; c.id === atleta.id)) return false;</w:t>
+            </w:r>
+          </w:p>
+          <w:p>
+            <w:pPr>
+              <w:spacing w:line="252" w:lineRule="auto" w:before="0" w:after="40"/>
+              <w:ind w:firstLine="0"/>
+              <w:jc w:val="left"/>
+            </w:pPr>
+            <w:r>
+              <w:rPr>
+                <w:rFonts w:ascii="Consolas" w:hAnsi="Consolas"/>
+                <w:color w:val="E2E8F0"/>
+                <w:sz w:val="19"/>
+              </w:rPr>
+            </w:r>
+          </w:p>
+          <w:p>
+            <w:pPr>
+              <w:spacing w:line="252" w:lineRule="auto" w:before="0" w:after="40"/>
+              <w:ind w:firstLine="0"/>
+              <w:jc w:val="left"/>
+            </w:pPr>
+            <w:r>
+              <w:rPr>
+                <w:rFonts w:ascii="Consolas" w:hAnsi="Consolas"/>
+                <w:color w:val="E2E8F0"/>
+                <w:sz w:val="19"/>
+              </w:rPr>
+              <w:t xml:space="preserve">  // 2. Limite máximo individual de participações (Equação 3.5)</w:t>
+            </w:r>
+          </w:p>
+          <w:p>
+            <w:pPr>
+              <w:spacing w:line="252" w:lineRule="auto" w:before="0" w:after="40"/>
+              <w:ind w:firstLine="0"/>
+              <w:jc w:val="left"/>
+            </w:pPr>
+            <w:r>
+              <w:rPr>
+                <w:rFonts w:ascii="Consolas" w:hAnsi="Consolas"/>
+                <w:color w:val="E2E8F0"/>
+                <w:sz w:val="19"/>
+              </w:rPr>
+              <w:t xml:space="preserve">  if (athleteCounts[atleta.id] &gt;= atleta.max) return false;</w:t>
+            </w:r>
+          </w:p>
+          <w:p>
+            <w:pPr>
+              <w:spacing w:line="252" w:lineRule="auto" w:before="0" w:after="40"/>
+              <w:ind w:firstLine="0"/>
+              <w:jc w:val="left"/>
+            </w:pPr>
+            <w:r>
+              <w:rPr>
+                <w:rFonts w:ascii="Consolas" w:hAnsi="Consolas"/>
+                <w:color w:val="E2E8F0"/>
+                <w:sz w:val="19"/>
+              </w:rPr>
+            </w:r>
+          </w:p>
+          <w:p>
+            <w:pPr>
+              <w:spacing w:line="252" w:lineRule="auto" w:before="0" w:after="40"/>
+              <w:ind w:firstLine="0"/>
+              <w:jc w:val="left"/>
+            </w:pPr>
+            <w:r>
+              <w:rPr>
+                <w:rFonts w:ascii="Consolas" w:hAnsi="Consolas"/>
+                <w:color w:val="E2E8F0"/>
+                <w:sz w:val="19"/>
+              </w:rPr>
+              <w:t xml:space="preserve">  // 3. Janela fisiológica de descanso (Equação 3.7): intervalo eta</w:t>
+            </w:r>
+          </w:p>
+          <w:p>
+            <w:pPr>
+              <w:spacing w:line="252" w:lineRule="auto" w:before="0" w:after="40"/>
+              <w:ind w:firstLine="0"/>
+              <w:jc w:val="left"/>
+            </w:pPr>
+            <w:r>
+              <w:rPr>
+                <w:rFonts w:ascii="Consolas" w:hAnsi="Consolas"/>
+                <w:color w:val="E2E8F0"/>
+                <w:sz w:val="19"/>
+              </w:rPr>
+              <w:t xml:space="preserve">  const assigned = athleteAssignedProvas[atleta.id] || [];</w:t>
+            </w:r>
+          </w:p>
+          <w:p>
+            <w:pPr>
+              <w:spacing w:line="252" w:lineRule="auto" w:before="0" w:after="40"/>
+              <w:ind w:firstLine="0"/>
+              <w:jc w:val="left"/>
+            </w:pPr>
+            <w:r>
+              <w:rPr>
+                <w:rFonts w:ascii="Consolas" w:hAnsi="Consolas"/>
+                <w:color w:val="E2E8F0"/>
+                <w:sz w:val="19"/>
+              </w:rPr>
+              <w:t xml:space="preserve">  const restConflict = assigned.some(idx =&gt; Math.abs(idx - pIndex) &lt;= inputConfig.restInterval);</w:t>
+            </w:r>
+          </w:p>
+          <w:p>
+            <w:pPr>
+              <w:spacing w:line="252" w:lineRule="auto" w:before="0" w:after="40"/>
+              <w:ind w:firstLine="0"/>
+              <w:jc w:val="left"/>
+            </w:pPr>
+            <w:r>
+              <w:rPr>
+                <w:rFonts w:ascii="Consolas" w:hAnsi="Consolas"/>
+                <w:color w:val="E2E8F0"/>
+                <w:sz w:val="19"/>
+              </w:rPr>
+              <w:t xml:space="preserve">  if (restConflict) return false;</w:t>
+            </w:r>
+          </w:p>
+          <w:p>
+            <w:pPr>
+              <w:spacing w:line="252" w:lineRule="auto" w:before="0" w:after="40"/>
+              <w:ind w:firstLine="0"/>
+              <w:jc w:val="left"/>
+            </w:pPr>
+            <w:r>
+              <w:rPr>
+                <w:rFonts w:ascii="Consolas" w:hAnsi="Consolas"/>
+                <w:color w:val="E2E8F0"/>
+                <w:sz w:val="19"/>
+              </w:rPr>
+            </w:r>
+          </w:p>
+          <w:p>
+            <w:pPr>
+              <w:spacing w:line="252" w:lineRule="auto" w:before="0" w:after="40"/>
+              <w:ind w:firstLine="0"/>
+              <w:jc w:val="left"/>
+            </w:pPr>
+            <w:r>
+              <w:rPr>
+                <w:rFonts w:ascii="Consolas" w:hAnsi="Consolas"/>
+                <w:color w:val="E2E8F0"/>
+                <w:sz w:val="19"/>
+              </w:rPr>
+              <w:t xml:space="preserve">  // 4. Aplicação rigorosa das regras de bloqueio cadastradas pelo técnico</w:t>
+            </w:r>
+          </w:p>
+          <w:p>
+            <w:pPr>
+              <w:spacing w:line="252" w:lineRule="auto" w:before="0" w:after="40"/>
+              <w:ind w:firstLine="0"/>
+              <w:jc w:val="left"/>
+            </w:pPr>
+            <w:r>
+              <w:rPr>
+                <w:rFonts w:ascii="Consolas" w:hAnsi="Consolas"/>
+                <w:color w:val="E2E8F0"/>
+                <w:sz w:val="19"/>
+              </w:rPr>
+              <w:t xml:space="preserve">  const blockRules = inputRestricoes.filter(r =&gt; r.type === 'block' &amp;&amp; r.atletaId === atleta.id);</w:t>
+            </w:r>
+          </w:p>
+          <w:p>
+            <w:pPr>
+              <w:spacing w:line="252" w:lineRule="auto" w:before="0" w:after="40"/>
+              <w:ind w:firstLine="0"/>
+              <w:jc w:val="left"/>
+            </w:pPr>
+            <w:r>
+              <w:rPr>
+                <w:rFonts w:ascii="Consolas" w:hAnsi="Consolas"/>
+                <w:color w:val="E2E8F0"/>
+                <w:sz w:val="19"/>
+              </w:rPr>
+              <w:t xml:space="preserve">  for (const bRule of blockRules) {</w:t>
+            </w:r>
+          </w:p>
+          <w:p>
+            <w:pPr>
+              <w:spacing w:line="252" w:lineRule="auto" w:before="0" w:after="40"/>
+              <w:ind w:firstLine="0"/>
+              <w:jc w:val="left"/>
+            </w:pPr>
+            <w:r>
+              <w:rPr>
+                <w:rFonts w:ascii="Consolas" w:hAnsi="Consolas"/>
+                <w:color w:val="E2E8F0"/>
+                <w:sz w:val="19"/>
+              </w:rPr>
+              <w:t xml:space="preserve">    if (bRule.blockedBoats?.includes(prova.boat)) return false;</w:t>
+            </w:r>
+          </w:p>
+          <w:p>
+            <w:pPr>
+              <w:spacing w:line="252" w:lineRule="auto" w:before="0" w:after="40"/>
+              <w:ind w:firstLine="0"/>
+              <w:jc w:val="left"/>
+            </w:pPr>
+            <w:r>
+              <w:rPr>
+                <w:rFonts w:ascii="Consolas" w:hAnsi="Consolas"/>
+                <w:color w:val="E2E8F0"/>
+                <w:sz w:val="19"/>
+              </w:rPr>
+              <w:t xml:space="preserve">    if (bRule.blockedProvaUids?.includes(prova.uid)) return false;</w:t>
+            </w:r>
+          </w:p>
+          <w:p>
+            <w:pPr>
+              <w:spacing w:line="252" w:lineRule="auto" w:before="0" w:after="40"/>
+              <w:ind w:firstLine="0"/>
+              <w:jc w:val="left"/>
+            </w:pPr>
+            <w:r>
+              <w:rPr>
+                <w:rFonts w:ascii="Consolas" w:hAnsi="Consolas"/>
+                <w:color w:val="E2E8F0"/>
+                <w:sz w:val="19"/>
+              </w:rPr>
+              <w:t xml:space="preserve">  }</w:t>
+            </w:r>
+          </w:p>
+          <w:p>
+            <w:pPr>
+              <w:spacing w:line="252" w:lineRule="auto" w:before="0" w:after="40"/>
+              <w:ind w:firstLine="0"/>
+              <w:jc w:val="left"/>
+            </w:pPr>
+            <w:r>
+              <w:rPr>
+                <w:rFonts w:ascii="Consolas" w:hAnsi="Consolas"/>
+                <w:color w:val="E2E8F0"/>
+                <w:sz w:val="19"/>
+              </w:rPr>
+              <w:t xml:space="preserve">  return true;</w:t>
+            </w:r>
+          </w:p>
+          <w:p>
+            <w:pPr>
+              <w:spacing w:line="252" w:lineRule="auto" w:before="0" w:after="40"/>
+              <w:ind w:firstLine="0"/>
+              <w:jc w:val="left"/>
+            </w:pPr>
+            <w:r>
+              <w:rPr>
+                <w:rFonts w:ascii="Consolas" w:hAnsi="Consolas"/>
+                <w:color w:val="E2E8F0"/>
+                <w:sz w:val="19"/>
+              </w:rPr>
+              <w:t>});</w:t>
+            </w:r>
+          </w:p>
+        </w:tc>
+      </w:tr>
+    </w:tbl>
+    <w:p>
+      <w:pPr>
+        <w:spacing w:line="276" w:lineRule="auto" w:before="60" w:after="200"/>
+        <w:ind w:firstLine="0"/>
+        <w:jc w:val="center"/>
+      </w:pPr>
+      <w:r>
+        <w:rPr>
+          <w:rFonts w:ascii="Arial" w:hAnsi="Arial"/>
+          <w:i/>
+          <w:color w:val="475569"/>
+          <w:sz w:val="19"/>
+        </w:rPr>
+        <w:t>Fonte: Elaborado pelo autor a partir do código-fonte (App.jsx, linhas 154–177).</w:t>
+      </w:r>
+    </w:p>
+    <w:p>
+      <w:pPr>
         <w:pStyle w:val="Heading2"/>
         <w:numPr>
           <w:ilvl w:val="1"/>
@@ -8311,6 +11218,378 @@
     </w:p>
     <w:p>
       <w:pPr>
+        <w:spacing w:line="276" w:lineRule="auto" w:before="200" w:after="80"/>
+        <w:ind w:firstLine="0"/>
+        <w:jc w:val="center"/>
+      </w:pPr>
+      <w:r>
+        <w:rPr>
+          <w:rFonts w:ascii="Arial" w:hAnsi="Arial"/>
+          <w:b/>
+          <w:color w:val="000000"/>
+          <w:sz w:val="21"/>
+        </w:rPr>
+        <w:t>Quadro 3 – Algoritmo de Validação Pré-Voo em Quatro Dimensões (getValidationStatus)</w:t>
+      </w:r>
+    </w:p>
+    <w:tbl>
+      <w:tblPr>
+        <w:tblW w:type="auto" w:w="0"/>
+        <w:jc w:val="center"/>
+        <w:tblLook w:firstColumn="1" w:firstRow="1" w:lastColumn="0" w:lastRow="0" w:noHBand="0" w:noVBand="1" w:val="04A0"/>
+      </w:tblPr>
+      <w:tblGrid>
+        <w:gridCol w:w="9072"/>
+      </w:tblGrid>
+      <w:tr>
+        <w:tc>
+          <w:tcPr>
+            <w:tcW w:type="dxa" w:w="9360"/>
+            <w:shd w:fill="0F172A"/>
+            <w:tcMar>
+              <w:top w:w="140" w:type="dxa"/>
+              <w:bottom w:w="140" w:type="dxa"/>
+              <w:left w:w="200" w:type="dxa"/>
+              <w:right w:w="200" w:type="dxa"/>
+            </w:tcMar>
+          </w:tcPr>
+          <w:p>
+            <w:pPr>
+              <w:spacing w:line="252" w:lineRule="auto" w:before="0" w:after="40"/>
+              <w:ind w:firstLine="0"/>
+              <w:jc w:val="left"/>
+            </w:pPr>
+            <w:r/>
+            <w:r>
+              <w:rPr>
+                <w:rFonts w:ascii="Consolas" w:hAnsi="Consolas"/>
+                <w:color w:val="E2E8F0"/>
+                <w:sz w:val="19"/>
+              </w:rPr>
+              <w:t>// Auditoria diagnóstica pré-voo em 4 dimensões antes de autorizar o solver</w:t>
+            </w:r>
+          </w:p>
+          <w:p>
+            <w:pPr>
+              <w:spacing w:line="252" w:lineRule="auto" w:before="0" w:after="40"/>
+              <w:ind w:firstLine="0"/>
+              <w:jc w:val="left"/>
+            </w:pPr>
+            <w:r>
+              <w:rPr>
+                <w:rFonts w:ascii="Consolas" w:hAnsi="Consolas"/>
+                <w:color w:val="E2E8F0"/>
+                <w:sz w:val="19"/>
+              </w:rPr>
+              <w:t>const getValidationStatus = () =&gt; {</w:t>
+            </w:r>
+          </w:p>
+          <w:p>
+            <w:pPr>
+              <w:spacing w:line="252" w:lineRule="auto" w:before="0" w:after="40"/>
+              <w:ind w:firstLine="0"/>
+              <w:jc w:val="left"/>
+            </w:pPr>
+            <w:r>
+              <w:rPr>
+                <w:rFonts w:ascii="Consolas" w:hAnsi="Consolas"/>
+                <w:color w:val="E2E8F0"/>
+                <w:sz w:val="19"/>
+              </w:rPr>
+              <w:t xml:space="preserve">  const configValid = config.penalty &gt;= 0 &amp;&amp; config.restInterval &gt;= 0;</w:t>
+            </w:r>
+          </w:p>
+          <w:p>
+            <w:pPr>
+              <w:spacing w:line="252" w:lineRule="auto" w:before="0" w:after="40"/>
+              <w:ind w:firstLine="0"/>
+              <w:jc w:val="left"/>
+            </w:pPr>
+            <w:r>
+              <w:rPr>
+                <w:rFonts w:ascii="Consolas" w:hAnsi="Consolas"/>
+                <w:color w:val="E2E8F0"/>
+                <w:sz w:val="19"/>
+              </w:rPr>
+              <w:t xml:space="preserve">  const provasValid = provas.length &gt; 0 &amp;&amp; provas.every(p =&gt; </w:t>
+            </w:r>
+          </w:p>
+          <w:p>
+            <w:pPr>
+              <w:spacing w:line="252" w:lineRule="auto" w:before="0" w:after="40"/>
+              <w:ind w:firstLine="0"/>
+              <w:jc w:val="left"/>
+            </w:pPr>
+            <w:r>
+              <w:rPr>
+                <w:rFonts w:ascii="Consolas" w:hAnsi="Consolas"/>
+                <w:color w:val="E2E8F0"/>
+                <w:sz w:val="19"/>
+              </w:rPr>
+              <w:t xml:space="preserve">    p.id.trim() !== '' &amp;&amp; p.date.trim() !== '' &amp;&amp; p.time.trim() !== '');</w:t>
+            </w:r>
+          </w:p>
+          <w:p>
+            <w:pPr>
+              <w:spacing w:line="252" w:lineRule="auto" w:before="0" w:after="40"/>
+              <w:ind w:firstLine="0"/>
+              <w:jc w:val="left"/>
+            </w:pPr>
+            <w:r>
+              <w:rPr>
+                <w:rFonts w:ascii="Consolas" w:hAnsi="Consolas"/>
+                <w:color w:val="E2E8F0"/>
+                <w:sz w:val="19"/>
+              </w:rPr>
+              <w:t xml:space="preserve">  const atletasValid = atletas.length &gt; 0 &amp;&amp; atletas.every(a =&gt; </w:t>
+            </w:r>
+          </w:p>
+          <w:p>
+            <w:pPr>
+              <w:spacing w:line="252" w:lineRule="auto" w:before="0" w:after="40"/>
+              <w:ind w:firstLine="0"/>
+              <w:jc w:val="left"/>
+            </w:pPr>
+            <w:r>
+              <w:rPr>
+                <w:rFonts w:ascii="Consolas" w:hAnsi="Consolas"/>
+                <w:color w:val="E2E8F0"/>
+                <w:sz w:val="19"/>
+              </w:rPr>
+              <w:t xml:space="preserve">    a.name.trim() !== '' &amp;&amp; a.min &lt;= a.max &amp;&amp; a.min &gt;= 0);</w:t>
+            </w:r>
+          </w:p>
+          <w:p>
+            <w:pPr>
+              <w:spacing w:line="252" w:lineRule="auto" w:before="0" w:after="40"/>
+              <w:ind w:firstLine="0"/>
+              <w:jc w:val="left"/>
+            </w:pPr>
+            <w:r>
+              <w:rPr>
+                <w:rFonts w:ascii="Consolas" w:hAnsi="Consolas"/>
+                <w:color w:val="E2E8F0"/>
+                <w:sz w:val="19"/>
+              </w:rPr>
+              <w:t xml:space="preserve">  const restricoesValid = restricoes.every(r =&gt; {</w:t>
+            </w:r>
+          </w:p>
+          <w:p>
+            <w:pPr>
+              <w:spacing w:line="252" w:lineRule="auto" w:before="0" w:after="40"/>
+              <w:ind w:firstLine="0"/>
+              <w:jc w:val="left"/>
+            </w:pPr>
+            <w:r>
+              <w:rPr>
+                <w:rFonts w:ascii="Consolas" w:hAnsi="Consolas"/>
+                <w:color w:val="E2E8F0"/>
+                <w:sz w:val="19"/>
+              </w:rPr>
+              <w:t xml:space="preserve">    if (r.type === 'block') {</w:t>
+            </w:r>
+          </w:p>
+          <w:p>
+            <w:pPr>
+              <w:spacing w:line="252" w:lineRule="auto" w:before="0" w:after="40"/>
+              <w:ind w:firstLine="0"/>
+              <w:jc w:val="left"/>
+            </w:pPr>
+            <w:r>
+              <w:rPr>
+                <w:rFonts w:ascii="Consolas" w:hAnsi="Consolas"/>
+                <w:color w:val="E2E8F0"/>
+                <w:sz w:val="19"/>
+              </w:rPr>
+              <w:t xml:space="preserve">      const atletaExists = atletas.some(a =&gt; a.id === r.atletaId);</w:t>
+            </w:r>
+          </w:p>
+          <w:p>
+            <w:pPr>
+              <w:spacing w:line="252" w:lineRule="auto" w:before="0" w:after="40"/>
+              <w:ind w:firstLine="0"/>
+              <w:jc w:val="left"/>
+            </w:pPr>
+            <w:r>
+              <w:rPr>
+                <w:rFonts w:ascii="Consolas" w:hAnsi="Consolas"/>
+                <w:color w:val="E2E8F0"/>
+                <w:sz w:val="19"/>
+              </w:rPr>
+              <w:t xml:space="preserve">      const validProvas = (r.blockedProvaUids || []).every(uid =&gt; provas.some(p =&gt; p.uid === uid));</w:t>
+            </w:r>
+          </w:p>
+          <w:p>
+            <w:pPr>
+              <w:spacing w:line="252" w:lineRule="auto" w:before="0" w:after="40"/>
+              <w:ind w:firstLine="0"/>
+              <w:jc w:val="left"/>
+            </w:pPr>
+            <w:r>
+              <w:rPr>
+                <w:rFonts w:ascii="Consolas" w:hAnsi="Consolas"/>
+                <w:color w:val="E2E8F0"/>
+                <w:sz w:val="19"/>
+              </w:rPr>
+              <w:t xml:space="preserve">      return atletaExists &amp;&amp; validProvas;</w:t>
+            </w:r>
+          </w:p>
+          <w:p>
+            <w:pPr>
+              <w:spacing w:line="252" w:lineRule="auto" w:before="0" w:after="40"/>
+              <w:ind w:firstLine="0"/>
+              <w:jc w:val="left"/>
+            </w:pPr>
+            <w:r>
+              <w:rPr>
+                <w:rFonts w:ascii="Consolas" w:hAnsi="Consolas"/>
+                <w:color w:val="E2E8F0"/>
+                <w:sz w:val="19"/>
+              </w:rPr>
+              <w:t xml:space="preserve">    } else {</w:t>
+            </w:r>
+          </w:p>
+          <w:p>
+            <w:pPr>
+              <w:spacing w:line="252" w:lineRule="auto" w:before="0" w:after="40"/>
+              <w:ind w:firstLine="0"/>
+              <w:jc w:val="left"/>
+            </w:pPr>
+            <w:r>
+              <w:rPr>
+                <w:rFonts w:ascii="Consolas" w:hAnsi="Consolas"/>
+                <w:color w:val="E2E8F0"/>
+                <w:sz w:val="19"/>
+              </w:rPr>
+              <w:t xml:space="preserve">      const provaExists = provas.some(p =&gt; p.uid === r.provaUid);</w:t>
+            </w:r>
+          </w:p>
+          <w:p>
+            <w:pPr>
+              <w:spacing w:line="252" w:lineRule="auto" w:before="0" w:after="40"/>
+              <w:ind w:firstLine="0"/>
+              <w:jc w:val="left"/>
+            </w:pPr>
+            <w:r>
+              <w:rPr>
+                <w:rFonts w:ascii="Consolas" w:hAnsi="Consolas"/>
+                <w:color w:val="E2E8F0"/>
+                <w:sz w:val="19"/>
+              </w:rPr>
+              <w:t xml:space="preserve">      const validAtletas = (r.atletaIds || []).length &gt; 0 &amp;&amp; </w:t>
+            </w:r>
+          </w:p>
+          <w:p>
+            <w:pPr>
+              <w:spacing w:line="252" w:lineRule="auto" w:before="0" w:after="40"/>
+              <w:ind w:firstLine="0"/>
+              <w:jc w:val="left"/>
+            </w:pPr>
+            <w:r>
+              <w:rPr>
+                <w:rFonts w:ascii="Consolas" w:hAnsi="Consolas"/>
+                <w:color w:val="E2E8F0"/>
+                <w:sz w:val="19"/>
+              </w:rPr>
+              <w:t xml:space="preserve">        (r.atletaIds || []).every(id =&gt; atletas.some(a =&gt; a.id === id));</w:t>
+            </w:r>
+          </w:p>
+          <w:p>
+            <w:pPr>
+              <w:spacing w:line="252" w:lineRule="auto" w:before="0" w:after="40"/>
+              <w:ind w:firstLine="0"/>
+              <w:jc w:val="left"/>
+            </w:pPr>
+            <w:r>
+              <w:rPr>
+                <w:rFonts w:ascii="Consolas" w:hAnsi="Consolas"/>
+                <w:color w:val="E2E8F0"/>
+                <w:sz w:val="19"/>
+              </w:rPr>
+              <w:t xml:space="preserve">      return provaExists &amp;&amp; validAtletas;</w:t>
+            </w:r>
+          </w:p>
+          <w:p>
+            <w:pPr>
+              <w:spacing w:line="252" w:lineRule="auto" w:before="0" w:after="40"/>
+              <w:ind w:firstLine="0"/>
+              <w:jc w:val="left"/>
+            </w:pPr>
+            <w:r>
+              <w:rPr>
+                <w:rFonts w:ascii="Consolas" w:hAnsi="Consolas"/>
+                <w:color w:val="E2E8F0"/>
+                <w:sz w:val="19"/>
+              </w:rPr>
+              <w:t xml:space="preserve">    }</w:t>
+            </w:r>
+          </w:p>
+          <w:p>
+            <w:pPr>
+              <w:spacing w:line="252" w:lineRule="auto" w:before="0" w:after="40"/>
+              <w:ind w:firstLine="0"/>
+              <w:jc w:val="left"/>
+            </w:pPr>
+            <w:r>
+              <w:rPr>
+                <w:rFonts w:ascii="Consolas" w:hAnsi="Consolas"/>
+                <w:color w:val="E2E8F0"/>
+                <w:sz w:val="19"/>
+              </w:rPr>
+              <w:t xml:space="preserve">  });</w:t>
+            </w:r>
+          </w:p>
+          <w:p>
+            <w:pPr>
+              <w:spacing w:line="252" w:lineRule="auto" w:before="0" w:after="40"/>
+              <w:ind w:firstLine="0"/>
+              <w:jc w:val="left"/>
+            </w:pPr>
+            <w:r>
+              <w:rPr>
+                <w:rFonts w:ascii="Consolas" w:hAnsi="Consolas"/>
+                <w:color w:val="E2E8F0"/>
+                <w:sz w:val="19"/>
+              </w:rPr>
+              <w:t xml:space="preserve">  return { configValid, provasValid, atletasValid, restricoesValid };</w:t>
+            </w:r>
+          </w:p>
+          <w:p>
+            <w:pPr>
+              <w:spacing w:line="252" w:lineRule="auto" w:before="0" w:after="40"/>
+              <w:ind w:firstLine="0"/>
+              <w:jc w:val="left"/>
+            </w:pPr>
+            <w:r>
+              <w:rPr>
+                <w:rFonts w:ascii="Consolas" w:hAnsi="Consolas"/>
+                <w:color w:val="E2E8F0"/>
+                <w:sz w:val="19"/>
+              </w:rPr>
+              <w:t>};</w:t>
+            </w:r>
+          </w:p>
+        </w:tc>
+      </w:tr>
+    </w:tbl>
+    <w:p>
+      <w:pPr>
+        <w:spacing w:line="276" w:lineRule="auto" w:before="60" w:after="200"/>
+        <w:ind w:firstLine="0"/>
+        <w:jc w:val="center"/>
+      </w:pPr>
+      <w:r>
+        <w:rPr>
+          <w:rFonts w:ascii="Arial" w:hAnsi="Arial"/>
+          <w:i/>
+          <w:color w:val="475569"/>
+          <w:sz w:val="19"/>
+        </w:rPr>
+        <w:t>Fonte: Elaborado pelo autor a partir do código-fonte (App.jsx, linhas 274–293).</w:t>
+      </w:r>
+    </w:p>
+    <w:p>
+      <w:pPr>
         <w:spacing w:after="240" w:before="240" w:lineRule="auto"/>
         <w:jc w:val="center"/>
         <w:rPr/>
@@ -8333,6 +11612,317 @@
         <w:rPr>
           <w:rtl w:val="0"/>
         </w:rPr>
+      </w:r>
+    </w:p>
+    <w:p>
+      <w:pPr>
+        <w:spacing w:line="276" w:lineRule="auto" w:before="200" w:after="80"/>
+        <w:ind w:firstLine="0"/>
+        <w:jc w:val="center"/>
+      </w:pPr>
+      <w:r>
+        <w:rPr>
+          <w:rFonts w:ascii="Arial" w:hAnsi="Arial"/>
+          <w:b/>
+          <w:color w:val="000000"/>
+          <w:sz w:val="21"/>
+        </w:rPr>
+        <w:t>Quadro 4 – Cálculo da Penalização Etária e Pontuação da Guarnição (getAdjustedScore e b_jk)</w:t>
+      </w:r>
+    </w:p>
+    <w:tbl>
+      <w:tblPr>
+        <w:tblW w:type="auto" w:w="0"/>
+        <w:jc w:val="center"/>
+        <w:tblLook w:firstColumn="1" w:firstRow="1" w:lastColumn="0" w:lastRow="0" w:noHBand="0" w:noVBand="1" w:val="04A0"/>
+      </w:tblPr>
+      <w:tblGrid>
+        <w:gridCol w:w="9072"/>
+      </w:tblGrid>
+      <w:tr>
+        <w:tc>
+          <w:tcPr>
+            <w:tcW w:type="dxa" w:w="9360"/>
+            <w:shd w:fill="0F172A"/>
+            <w:tcMar>
+              <w:top w:w="140" w:type="dxa"/>
+              <w:bottom w:w="140" w:type="dxa"/>
+              <w:left w:w="200" w:type="dxa"/>
+              <w:right w:w="200" w:type="dxa"/>
+            </w:tcMar>
+          </w:tcPr>
+          <w:p>
+            <w:pPr>
+              <w:spacing w:line="252" w:lineRule="auto" w:before="0" w:after="40"/>
+              <w:ind w:firstLine="0"/>
+              <w:jc w:val="left"/>
+            </w:pPr>
+            <w:r/>
+            <w:r>
+              <w:rPr>
+                <w:rFonts w:ascii="Consolas" w:hAnsi="Consolas"/>
+                <w:color w:val="E2E8F0"/>
+                <w:sz w:val="19"/>
+              </w:rPr>
+              <w:t>// Cálculo do grau de desempenho individual com penalização etária (Equação 3.8)</w:t>
+            </w:r>
+          </w:p>
+          <w:p>
+            <w:pPr>
+              <w:spacing w:line="252" w:lineRule="auto" w:before="0" w:after="40"/>
+              <w:ind w:firstLine="0"/>
+              <w:jc w:val="left"/>
+            </w:pPr>
+            <w:r>
+              <w:rPr>
+                <w:rFonts w:ascii="Consolas" w:hAnsi="Consolas"/>
+                <w:color w:val="E2E8F0"/>
+                <w:sz w:val="19"/>
+              </w:rPr>
+              <w:t>const getAdjustedScore = (atleta) =&gt; {</w:t>
+            </w:r>
+          </w:p>
+          <w:p>
+            <w:pPr>
+              <w:spacing w:line="252" w:lineRule="auto" w:before="0" w:after="40"/>
+              <w:ind w:firstLine="0"/>
+              <w:jc w:val="left"/>
+            </w:pPr>
+            <w:r>
+              <w:rPr>
+                <w:rFonts w:ascii="Consolas" w:hAnsi="Consolas"/>
+                <w:color w:val="E2E8F0"/>
+                <w:sz w:val="19"/>
+              </w:rPr>
+              <w:t xml:space="preserve">  const ageDiff = atleta.age - targetMinAge;</w:t>
+            </w:r>
+          </w:p>
+          <w:p>
+            <w:pPr>
+              <w:spacing w:line="252" w:lineRule="auto" w:before="0" w:after="40"/>
+              <w:ind w:firstLine="0"/>
+              <w:jc w:val="left"/>
+            </w:pPr>
+            <w:r>
+              <w:rPr>
+                <w:rFonts w:ascii="Consolas" w:hAnsi="Consolas"/>
+                <w:color w:val="E2E8F0"/>
+                <w:sz w:val="19"/>
+              </w:rPr>
+              <w:t xml:space="preserve">  return atleta.score - (ageDiff * inputConfig.penalty);</w:t>
+            </w:r>
+          </w:p>
+          <w:p>
+            <w:pPr>
+              <w:spacing w:line="252" w:lineRule="auto" w:before="0" w:after="40"/>
+              <w:ind w:firstLine="0"/>
+              <w:jc w:val="left"/>
+            </w:pPr>
+            <w:r>
+              <w:rPr>
+                <w:rFonts w:ascii="Consolas" w:hAnsi="Consolas"/>
+                <w:color w:val="E2E8F0"/>
+                <w:sz w:val="19"/>
+              </w:rPr>
+              <w:t>};</w:t>
+            </w:r>
+          </w:p>
+          <w:p>
+            <w:pPr>
+              <w:spacing w:line="252" w:lineRule="auto" w:before="0" w:after="40"/>
+              <w:ind w:firstLine="0"/>
+              <w:jc w:val="left"/>
+            </w:pPr>
+            <w:r>
+              <w:rPr>
+                <w:rFonts w:ascii="Consolas" w:hAnsi="Consolas"/>
+                <w:color w:val="E2E8F0"/>
+                <w:sz w:val="19"/>
+              </w:rPr>
+            </w:r>
+          </w:p>
+          <w:p>
+            <w:pPr>
+              <w:spacing w:line="252" w:lineRule="auto" w:before="0" w:after="40"/>
+              <w:ind w:firstLine="0"/>
+              <w:jc w:val="left"/>
+            </w:pPr>
+            <w:r>
+              <w:rPr>
+                <w:rFonts w:ascii="Consolas" w:hAnsi="Consolas"/>
+                <w:color w:val="E2E8F0"/>
+                <w:sz w:val="19"/>
+              </w:rPr>
+              <w:t>// Formação da tripulação e cálculo do grau final médio do barco (b_jk)</w:t>
+            </w:r>
+          </w:p>
+          <w:p>
+            <w:pPr>
+              <w:spacing w:line="252" w:lineRule="auto" w:before="0" w:after="40"/>
+              <w:ind w:firstLine="0"/>
+              <w:jc w:val="left"/>
+            </w:pPr>
+            <w:r>
+              <w:rPr>
+                <w:rFonts w:ascii="Consolas" w:hAnsi="Consolas"/>
+                <w:color w:val="E2E8F0"/>
+                <w:sz w:val="19"/>
+              </w:rPr>
+              <w:t>if (crew.length === seats) {</w:t>
+            </w:r>
+          </w:p>
+          <w:p>
+            <w:pPr>
+              <w:spacing w:line="252" w:lineRule="auto" w:before="0" w:after="40"/>
+              <w:ind w:firstLine="0"/>
+              <w:jc w:val="left"/>
+            </w:pPr>
+            <w:r>
+              <w:rPr>
+                <w:rFonts w:ascii="Consolas" w:hAnsi="Consolas"/>
+                <w:color w:val="E2E8F0"/>
+                <w:sz w:val="19"/>
+              </w:rPr>
+              <w:t xml:space="preserve">  const avgAge = (crew.reduce((sum, a) =&gt; sum + a.age, 0) / seats).toFixed(1);</w:t>
+            </w:r>
+          </w:p>
+          <w:p>
+            <w:pPr>
+              <w:spacing w:line="252" w:lineRule="auto" w:before="0" w:after="40"/>
+              <w:ind w:firstLine="0"/>
+              <w:jc w:val="left"/>
+            </w:pPr>
+            <w:r>
+              <w:rPr>
+                <w:rFonts w:ascii="Consolas" w:hAnsi="Consolas"/>
+                <w:color w:val="E2E8F0"/>
+                <w:sz w:val="19"/>
+              </w:rPr>
+              <w:t xml:space="preserve">  const adjustedScores = crew.map(a =&gt; {</w:t>
+            </w:r>
+          </w:p>
+          <w:p>
+            <w:pPr>
+              <w:spacing w:line="252" w:lineRule="auto" w:before="0" w:after="40"/>
+              <w:ind w:firstLine="0"/>
+              <w:jc w:val="left"/>
+            </w:pPr>
+            <w:r>
+              <w:rPr>
+                <w:rFonts w:ascii="Consolas" w:hAnsi="Consolas"/>
+                <w:color w:val="E2E8F0"/>
+                <w:sz w:val="19"/>
+              </w:rPr>
+              <w:t xml:space="preserve">    const ageDiff = a.age - targetMinAge;</w:t>
+            </w:r>
+          </w:p>
+          <w:p>
+            <w:pPr>
+              <w:spacing w:line="252" w:lineRule="auto" w:before="0" w:after="40"/>
+              <w:ind w:firstLine="0"/>
+              <w:jc w:val="left"/>
+            </w:pPr>
+            <w:r>
+              <w:rPr>
+                <w:rFonts w:ascii="Consolas" w:hAnsi="Consolas"/>
+                <w:color w:val="E2E8F0"/>
+                <w:sz w:val="19"/>
+              </w:rPr>
+              <w:t xml:space="preserve">    return Math.max(0, a.score - (ageDiff * inputConfig.penalty));</w:t>
+            </w:r>
+          </w:p>
+          <w:p>
+            <w:pPr>
+              <w:spacing w:line="252" w:lineRule="auto" w:before="0" w:after="40"/>
+              <w:ind w:firstLine="0"/>
+              <w:jc w:val="left"/>
+            </w:pPr>
+            <w:r>
+              <w:rPr>
+                <w:rFonts w:ascii="Consolas" w:hAnsi="Consolas"/>
+                <w:color w:val="E2E8F0"/>
+                <w:sz w:val="19"/>
+              </w:rPr>
+              <w:t xml:space="preserve">  });</w:t>
+            </w:r>
+          </w:p>
+          <w:p>
+            <w:pPr>
+              <w:spacing w:line="252" w:lineRule="auto" w:before="0" w:after="40"/>
+              <w:ind w:firstLine="0"/>
+              <w:jc w:val="left"/>
+            </w:pPr>
+            <w:r>
+              <w:rPr>
+                <w:rFonts w:ascii="Consolas" w:hAnsi="Consolas"/>
+                <w:color w:val="E2E8F0"/>
+                <w:sz w:val="19"/>
+              </w:rPr>
+              <w:t xml:space="preserve">  const boatScore = (adjustedScores.reduce((sum, s) =&gt; sum + s, 0) / seats);</w:t>
+            </w:r>
+          </w:p>
+          <w:p>
+            <w:pPr>
+              <w:spacing w:line="252" w:lineRule="auto" w:before="0" w:after="40"/>
+              <w:ind w:firstLine="0"/>
+              <w:jc w:val="left"/>
+            </w:pPr>
+            <w:r>
+              <w:rPr>
+                <w:rFonts w:ascii="Consolas" w:hAnsi="Consolas"/>
+                <w:color w:val="E2E8F0"/>
+                <w:sz w:val="19"/>
+              </w:rPr>
+              <w:t xml:space="preserve">  // Registro da guarnição otimizada para o relatório final</w:t>
+            </w:r>
+          </w:p>
+          <w:p>
+            <w:pPr>
+              <w:spacing w:line="252" w:lineRule="auto" w:before="0" w:after="40"/>
+              <w:ind w:firstLine="0"/>
+              <w:jc w:val="left"/>
+            </w:pPr>
+            <w:r>
+              <w:rPr>
+                <w:rFonts w:ascii="Consolas" w:hAnsi="Consolas"/>
+                <w:color w:val="E2E8F0"/>
+                <w:sz w:val="19"/>
+              </w:rPr>
+              <w:t xml:space="preserve">  allocatedProvas.push({ id: prova.id, boat: prova.boat, class: prova.ageClass, age: avgAge, score: boatScore.toFixed(3) });</w:t>
+            </w:r>
+          </w:p>
+          <w:p>
+            <w:pPr>
+              <w:spacing w:line="252" w:lineRule="auto" w:before="0" w:after="40"/>
+              <w:ind w:firstLine="0"/>
+              <w:jc w:val="left"/>
+            </w:pPr>
+            <w:r>
+              <w:rPr>
+                <w:rFonts w:ascii="Consolas" w:hAnsi="Consolas"/>
+                <w:color w:val="E2E8F0"/>
+                <w:sz w:val="19"/>
+              </w:rPr>
+              <w:t>}</w:t>
+            </w:r>
+          </w:p>
+        </w:tc>
+      </w:tr>
+    </w:tbl>
+    <w:p>
+      <w:pPr>
+        <w:spacing w:line="276" w:lineRule="auto" w:before="60" w:after="200"/>
+        <w:ind w:firstLine="0"/>
+        <w:jc w:val="center"/>
+      </w:pPr>
+      <w:r>
+        <w:rPr>
+          <w:rFonts w:ascii="Arial" w:hAnsi="Arial"/>
+          <w:i/>
+          <w:color w:val="475569"/>
+          <w:sz w:val="19"/>
+        </w:rPr>
+        <w:t>Fonte: Elaborado pelo autor a partir do código-fonte (App.jsx, linhas 180–225).</w:t>
       </w:r>
     </w:p>
     <w:p>

</xml_diff>